<commit_message>
docs, parametry + přidání kvízu
</commit_message>
<xml_diff>
--- a/docs/TS-semestrálka-hrouda.docx
+++ b/docs/TS-semestrálka-hrouda.docx
@@ -732,6 +732,7 @@
             </w:tabs>
             <w:spacing/>
             <w:ind/>
+            <w:jc w:val="left"/>
             <w:rPr>
               <w:highlight w:val="none"/>
             </w:rPr>
@@ -784,6 +785,11 @@
               <w:fldChar w:fldCharType="begin"/>
               <w:instrText xml:space="preserve">PAGEREF _Toc1 \h</w:instrText>
               <w:fldChar w:fldCharType="separate"/>
+              <w:tab/>
+              <w:tab/>
+              <w:tab/>
+              <w:tab/>
+              <w:tab/>
               <w:t xml:space="preserve">2</w:t>
               <w:fldChar w:fldCharType="end"/>
             </w:r>
@@ -803,6 +809,7 @@
             </w:tabs>
             <w:spacing/>
             <w:ind/>
+            <w:jc w:val="left"/>
             <w:rPr/>
           </w:pPr>
           <w:hyperlink w:tooltip="#_Toc2" w:anchor="_Toc2" w:history="1">
@@ -830,6 +837,11 @@
               <w:tab/>
             </w:r>
             <w:r>
+              <w:tab/>
+              <w:tab/>
+              <w:tab/>
+              <w:tab/>
+              <w:tab/>
               <w:fldChar w:fldCharType="begin"/>
               <w:instrText xml:space="preserve">PAGEREF _Toc2 \h</w:instrText>
               <w:fldChar w:fldCharType="separate"/>
@@ -848,9 +860,312 @@
             </w:tabs>
             <w:spacing/>
             <w:ind/>
+            <w:jc w:val="left"/>
+            <w:rPr>
+              <w:b w:val="0"/>
+              <w:bCs w:val="0"/>
+              <w:highlight w:val="none"/>
+            </w:rPr>
+          </w:pPr>
+          <w:hyperlink w:tooltip="#_Toc3" w:anchor="_Toc3" w:history="1">
+            <w:r>
+              <w:rPr>
+                <w:rStyle w:val="926"/>
+              </w:rPr>
+            </w:r>
+            <w:r>
+              <w:rPr>
+                <w:rStyle w:val="926"/>
+                <w:b w:val="0"/>
+                <w:bCs w:val="0"/>
+                <w:highlight w:val="none"/>
+                <w:lang w:val="cs-CZ"/>
+              </w:rPr>
+              <w:t xml:space="preserve">Popis funkcinality aplikace</w:t>
+            </w:r>
+            <w:r>
+              <w:rPr>
+                <w:rStyle w:val="926"/>
+                <w:b w:val="0"/>
+                <w:bCs w:val="0"/>
+                <w:highlight w:val="none"/>
+              </w:rPr>
+            </w:r>
+            <w:r>
+              <w:tab/>
+              <w:tab/>
+              <w:tab/>
+              <w:tab/>
+              <w:tab/>
+              <w:tab/>
+            </w:r>
+            <w:r>
+              <w:fldChar w:fldCharType="begin"/>
+              <w:instrText xml:space="preserve">PAGEREF _Toc3 \h</w:instrText>
+              <w:fldChar w:fldCharType="separate"/>
+              <w:t xml:space="preserve">2</w:t>
+              <w:fldChar w:fldCharType="end"/>
+            </w:r>
+          </w:hyperlink>
+          <w:r>
+            <w:rPr>
+              <w:b w:val="0"/>
+              <w:bCs w:val="0"/>
+              <w:highlight w:val="none"/>
+            </w:rPr>
+          </w:r>
+          <w:r>
+            <w:rPr>
+              <w:b w:val="0"/>
+              <w:bCs w:val="0"/>
+              <w:highlight w:val="none"/>
+            </w:rPr>
+          </w:r>
+        </w:p>
+        <w:p>
+          <w:pPr>
+            <w:pStyle w:val="929"/>
+            <w:pBdr/>
+            <w:tabs>
+              <w:tab w:val="left" w:leader="none" w:pos="3407"/>
+            </w:tabs>
+            <w:spacing/>
+            <w:ind/>
+            <w:jc w:val="left"/>
             <w:rPr/>
           </w:pPr>
-          <w:hyperlink w:tooltip="#_Toc3" w:anchor="_Toc3" w:history="1">
+          <w:hyperlink w:tooltip="#_Toc4" w:anchor="_Toc4" w:history="1">
+            <w:r>
+              <w:rPr>
+                <w:rStyle w:val="926"/>
+              </w:rPr>
+            </w:r>
+            <w:r>
+              <w:rPr>
+                <w:rStyle w:val="926"/>
+                <w:b w:val="0"/>
+                <w:bCs w:val="0"/>
+                <w:highlight w:val="none"/>
+                <w:lang w:val="cs-CZ"/>
+              </w:rPr>
+              <w:t xml:space="preserve">Uživatelské role</w:t>
+            </w:r>
+            <w:r>
+              <w:rPr>
+                <w:rStyle w:val="926"/>
+              </w:rPr>
+            </w:r>
+            <w:r>
+              <w:tab/>
+            </w:r>
+            <w:r>
+              <w:tab/>
+              <w:tab/>
+              <w:tab/>
+              <w:tab/>
+              <w:tab/>
+              <w:fldChar w:fldCharType="begin"/>
+              <w:instrText xml:space="preserve">PAGEREF _Toc4 \h</w:instrText>
+              <w:fldChar w:fldCharType="separate"/>
+              <w:t xml:space="preserve">2</w:t>
+              <w:fldChar w:fldCharType="end"/>
+            </w:r>
+          </w:hyperlink>
+          <w:r/>
+        </w:p>
+        <w:p>
+          <w:pPr>
+            <w:pStyle w:val="929"/>
+            <w:pBdr/>
+            <w:tabs>
+              <w:tab w:val="left" w:leader="none" w:pos="3407"/>
+            </w:tabs>
+            <w:spacing/>
+            <w:ind/>
+            <w:jc w:val="left"/>
+            <w:rPr>
+              <w:b w:val="0"/>
+              <w:bCs w:val="0"/>
+            </w:rPr>
+          </w:pPr>
+          <w:hyperlink w:tooltip="#_Toc5" w:anchor="_Toc5" w:history="1">
+            <w:r>
+              <w:rPr>
+                <w:rStyle w:val="926"/>
+              </w:rPr>
+            </w:r>
+            <w:r>
+              <w:rPr>
+                <w:rStyle w:val="926"/>
+                <w:b w:val="0"/>
+                <w:bCs w:val="0"/>
+                <w:highlight w:val="none"/>
+                <w:lang w:val="cs-CZ"/>
+              </w:rPr>
+              <w:t xml:space="preserve">Zákaznická část</w:t>
+            </w:r>
+            <w:r>
+              <w:rPr>
+                <w:rStyle w:val="926"/>
+                <w:b w:val="0"/>
+                <w:bCs w:val="0"/>
+                <w:highlight w:val="none"/>
+                <w:lang w:val="cs-CZ"/>
+              </w:rPr>
+            </w:r>
+            <w:r>
+              <w:tab/>
+            </w:r>
+            <w:r>
+              <w:fldChar w:fldCharType="begin"/>
+              <w:instrText xml:space="preserve">PAGEREF _Toc5 \h</w:instrText>
+              <w:fldChar w:fldCharType="separate"/>
+              <w:tab/>
+              <w:tab/>
+              <w:tab/>
+              <w:tab/>
+              <w:tab/>
+              <w:t xml:space="preserve">2</w:t>
+              <w:fldChar w:fldCharType="end"/>
+            </w:r>
+          </w:hyperlink>
+          <w:r>
+            <w:rPr>
+              <w:b w:val="0"/>
+              <w:bCs w:val="0"/>
+            </w:rPr>
+          </w:r>
+          <w:r>
+            <w:rPr>
+              <w:b w:val="0"/>
+              <w:bCs w:val="0"/>
+            </w:rPr>
+          </w:r>
+        </w:p>
+        <w:p>
+          <w:pPr>
+            <w:pStyle w:val="929"/>
+            <w:pBdr/>
+            <w:tabs>
+              <w:tab w:val="left" w:leader="none" w:pos="3407"/>
+            </w:tabs>
+            <w:spacing/>
+            <w:ind/>
+            <w:jc w:val="left"/>
+            <w:rPr/>
+          </w:pPr>
+          <w:hyperlink w:tooltip="#_Toc6" w:anchor="_Toc6" w:history="1">
+            <w:r>
+              <w:rPr>
+                <w:rStyle w:val="926"/>
+              </w:rPr>
+            </w:r>
+            <w:r>
+              <w:rPr>
+                <w:rStyle w:val="926"/>
+                <w:b w:val="0"/>
+                <w:bCs w:val="0"/>
+                <w:highlight w:val="none"/>
+                <w:lang w:val="cs-CZ"/>
+              </w:rPr>
+              <w:t xml:space="preserve">Administrátorská část</w:t>
+            </w:r>
+            <w:r>
+              <w:rPr>
+                <w:rStyle w:val="926"/>
+              </w:rPr>
+            </w:r>
+            <w:r>
+              <w:tab/>
+              <w:tab/>
+            </w:r>
+            <w:r>
+              <w:rPr>
+                <w:lang w:val="cs-CZ"/>
+              </w:rPr>
+              <w:tab/>
+              <w:tab/>
+              <w:tab/>
+              <w:tab/>
+            </w:r>
+            <w:r>
+              <w:fldChar w:fldCharType="begin"/>
+              <w:instrText xml:space="preserve">PAGEREF _Toc6 \h</w:instrText>
+              <w:fldChar w:fldCharType="separate"/>
+              <w:t xml:space="preserve">3</w:t>
+              <w:fldChar w:fldCharType="end"/>
+            </w:r>
+          </w:hyperlink>
+          <w:r/>
+          <w:r/>
+        </w:p>
+        <w:p>
+          <w:pPr>
+            <w:pStyle w:val="928"/>
+            <w:pBdr/>
+            <w:tabs>
+              <w:tab w:val="left" w:leader="none" w:pos="3407"/>
+            </w:tabs>
+            <w:spacing/>
+            <w:ind/>
+            <w:jc w:val="left"/>
+            <w:rPr>
+              <w:highlight w:val="none"/>
+            </w:rPr>
+          </w:pPr>
+          <w:hyperlink w:tooltip="#_Toc7" w:anchor="_Toc7" w:history="1">
+            <w:r>
+              <w:rPr>
+                <w:rStyle w:val="926"/>
+              </w:rPr>
+            </w:r>
+            <w:r>
+              <w:rPr>
+                <w:rStyle w:val="926"/>
+                <w:lang w:val="cs-CZ"/>
+              </w:rPr>
+              <w:t xml:space="preserve">Prioritizace částí aplikace</w:t>
+            </w:r>
+            <w:r>
+              <w:rPr>
+                <w:rStyle w:val="926"/>
+              </w:rPr>
+            </w:r>
+            <w:r>
+              <w:tab/>
+              <w:tab/>
+              <w:tab/>
+              <w:tab/>
+              <w:tab/>
+              <w:tab/>
+            </w:r>
+            <w:r>
+              <w:fldChar w:fldCharType="begin"/>
+              <w:instrText xml:space="preserve">PAGEREF _Toc7 \h</w:instrText>
+              <w:fldChar w:fldCharType="separate"/>
+              <w:t xml:space="preserve">3</w:t>
+              <w:fldChar w:fldCharType="end"/>
+            </w:r>
+          </w:hyperlink>
+          <w:r>
+            <w:rPr>
+              <w:highlight w:val="none"/>
+            </w:rPr>
+          </w:r>
+        </w:p>
+        <w:p>
+          <w:pPr>
+            <w:pStyle w:val="928"/>
+            <w:pBdr/>
+            <w:tabs>
+              <w:tab w:val="left" w:leader="none" w:pos="3407"/>
+            </w:tabs>
+            <w:spacing/>
+            <w:ind/>
+            <w:jc w:val="left"/>
+            <w:rPr/>
+          </w:pPr>
+          <w:hyperlink w:tooltip="#_Toc8" w:anchor="_Toc8" w:history="1">
             <w:r>
               <w:rPr>
                 <w:rStyle w:val="926"/>
@@ -873,12 +1188,17 @@
             </w:r>
             <w:r>
               <w:tab/>
+              <w:tab/>
+              <w:tab/>
+              <w:tab/>
+              <w:tab/>
+              <w:tab/>
             </w:r>
             <w:r>
               <w:fldChar w:fldCharType="begin"/>
-              <w:instrText xml:space="preserve">PAGEREF _Toc3 \h</w:instrText>
+              <w:instrText xml:space="preserve">PAGEREF _Toc8 \h</w:instrText>
               <w:fldChar w:fldCharType="separate"/>
-              <w:t xml:space="preserve">2</w:t>
+              <w:t xml:space="preserve">3</w:t>
               <w:fldChar w:fldCharType="end"/>
             </w:r>
           </w:hyperlink>
@@ -893,9 +1213,10 @@
             </w:tabs>
             <w:spacing/>
             <w:ind/>
+            <w:jc w:val="left"/>
             <w:rPr/>
           </w:pPr>
-          <w:hyperlink w:tooltip="#_Toc4" w:anchor="_Toc4" w:history="1">
+          <w:hyperlink w:tooltip="#_Toc9" w:anchor="_Toc9" w:history="1">
             <w:r>
               <w:rPr>
                 <w:rStyle w:val="926"/>
@@ -915,15 +1236,23 @@
             </w:r>
             <w:r>
               <w:tab/>
+              <w:tab/>
+              <w:tab/>
+              <w:tab/>
+              <w:tab/>
+            </w:r>
+            <w:r>
+              <w:tab/>
             </w:r>
             <w:r>
               <w:fldChar w:fldCharType="begin"/>
-              <w:instrText xml:space="preserve">PAGEREF _Toc4 \h</w:instrText>
+              <w:instrText xml:space="preserve">PAGEREF _Toc9 \h</w:instrText>
               <w:fldChar w:fldCharType="separate"/>
-              <w:t xml:space="preserve">2</w:t>
+              <w:t xml:space="preserve">3</w:t>
               <w:fldChar w:fldCharType="end"/>
             </w:r>
           </w:hyperlink>
+          <w:r/>
           <w:r/>
         </w:p>
         <w:p>
@@ -935,9 +1264,10 @@
             </w:tabs>
             <w:spacing/>
             <w:ind/>
+            <w:jc w:val="left"/>
             <w:rPr/>
           </w:pPr>
-          <w:hyperlink w:tooltip="#_Toc5" w:anchor="_Toc5" w:history="1">
+          <w:hyperlink w:tooltip="#_Toc10" w:anchor="_Toc10" w:history="1">
             <w:r>
               <w:rPr>
                 <w:rStyle w:val="926"/>
@@ -960,12 +1290,17 @@
             </w:r>
             <w:r>
               <w:tab/>
+              <w:tab/>
+              <w:tab/>
+              <w:tab/>
+              <w:tab/>
+              <w:tab/>
             </w:r>
             <w:r>
               <w:fldChar w:fldCharType="begin"/>
-              <w:instrText xml:space="preserve">PAGEREF _Toc5 \h</w:instrText>
+              <w:instrText xml:space="preserve">PAGEREF _Toc10 \h</w:instrText>
               <w:fldChar w:fldCharType="separate"/>
-              <w:t xml:space="preserve">2</w:t>
+              <w:t xml:space="preserve">3</w:t>
               <w:fldChar w:fldCharType="end"/>
             </w:r>
           </w:hyperlink>
@@ -980,9 +1315,10 @@
             </w:tabs>
             <w:spacing/>
             <w:ind/>
+            <w:jc w:val="left"/>
             <w:rPr/>
           </w:pPr>
-          <w:hyperlink w:tooltip="#_Toc6" w:anchor="_Toc6" w:history="1">
+          <w:hyperlink w:tooltip="#_Toc11" w:anchor="_Toc11" w:history="1">
             <w:r>
               <w:rPr>
                 <w:rStyle w:val="926"/>
@@ -1002,12 +1338,17 @@
             </w:r>
             <w:r>
               <w:tab/>
+              <w:tab/>
+              <w:tab/>
+              <w:tab/>
+              <w:tab/>
+              <w:tab/>
             </w:r>
             <w:r>
               <w:fldChar w:fldCharType="begin"/>
-              <w:instrText xml:space="preserve">PAGEREF _Toc6 \h</w:instrText>
+              <w:instrText xml:space="preserve">PAGEREF _Toc11 \h</w:instrText>
               <w:fldChar w:fldCharType="separate"/>
-              <w:t xml:space="preserve">2</w:t>
+              <w:t xml:space="preserve">3</w:t>
               <w:fldChar w:fldCharType="end"/>
             </w:r>
           </w:hyperlink>
@@ -1022,9 +1363,10 @@
             </w:tabs>
             <w:spacing/>
             <w:ind/>
+            <w:jc w:val="left"/>
             <w:rPr/>
           </w:pPr>
-          <w:hyperlink w:tooltip="#_Toc7" w:anchor="_Toc7" w:history="1">
+          <w:hyperlink w:tooltip="#_Toc12" w:anchor="_Toc12" w:history="1">
             <w:r>
               <w:rPr>
                 <w:rStyle w:val="926"/>
@@ -1044,10 +1386,15 @@
             </w:r>
             <w:r>
               <w:tab/>
+              <w:tab/>
+              <w:tab/>
+              <w:tab/>
+              <w:tab/>
+              <w:tab/>
             </w:r>
             <w:r>
               <w:fldChar w:fldCharType="begin"/>
-              <w:instrText xml:space="preserve">PAGEREF _Toc7 \h</w:instrText>
+              <w:instrText xml:space="preserve">PAGEREF _Toc12 \h</w:instrText>
               <w:fldChar w:fldCharType="separate"/>
               <w:t xml:space="preserve">3</w:t>
               <w:fldChar w:fldCharType="end"/>
@@ -1064,13 +1411,14 @@
             </w:tabs>
             <w:spacing/>
             <w:ind/>
+            <w:jc w:val="left"/>
             <w:rPr>
               <w:b w:val="0"/>
               <w:bCs w:val="0"/>
               <w:highlight w:val="none"/>
             </w:rPr>
           </w:pPr>
-          <w:hyperlink w:tooltip="#_Toc8" w:anchor="_Toc8" w:history="1">
+          <w:hyperlink w:tooltip="#_Toc13" w:anchor="_Toc13" w:history="1">
             <w:r>
               <w:rPr>
                 <w:rStyle w:val="926"/>
@@ -1097,12 +1445,17 @@
             </w:r>
             <w:r>
               <w:tab/>
+              <w:tab/>
+              <w:tab/>
+              <w:tab/>
+              <w:tab/>
+              <w:tab/>
             </w:r>
             <w:r>
               <w:fldChar w:fldCharType="begin"/>
-              <w:instrText xml:space="preserve">PAGEREF _Toc8 \h</w:instrText>
+              <w:instrText xml:space="preserve">PAGEREF _Toc13 \h</w:instrText>
               <w:fldChar w:fldCharType="separate"/>
-              <w:t xml:space="preserve">3</w:t>
+              <w:t xml:space="preserve">4</w:t>
               <w:fldChar w:fldCharType="end"/>
             </w:r>
           </w:hyperlink>
@@ -1124,9 +1477,10 @@
             </w:tabs>
             <w:spacing/>
             <w:ind/>
+            <w:jc w:val="left"/>
             <w:rPr/>
           </w:pPr>
-          <w:hyperlink w:tooltip="#_Toc9" w:anchor="_Toc9" w:history="1">
+          <w:hyperlink w:tooltip="#_Toc14" w:anchor="_Toc14" w:history="1">
             <w:r>
               <w:rPr>
                 <w:rStyle w:val="926"/>
@@ -1149,9 +1503,9 @@
             </w:r>
             <w:r>
               <w:fldChar w:fldCharType="begin"/>
-              <w:instrText xml:space="preserve">PAGEREF _Toc9 \h</w:instrText>
+              <w:instrText xml:space="preserve">PAGEREF _Toc14 \h</w:instrText>
               <w:fldChar w:fldCharType="separate"/>
-              <w:t xml:space="preserve">3</w:t>
+              <w:t xml:space="preserve">4</w:t>
               <w:fldChar w:fldCharType="end"/>
             </w:r>
           </w:hyperlink>
@@ -1162,6 +1516,7 @@
             <w:pBdr/>
             <w:spacing/>
             <w:ind/>
+            <w:jc w:val="left"/>
             <w:rPr>
               <w:highlight w:val="none"/>
             </w:rPr>
@@ -1199,24 +1554,20 @@
           <w:highlight w:val="none"/>
         </w:rPr>
       </w:r>
-      <w:r>
+    </w:p>
+    <w:p>
+      <w:pPr>
+        <w:pStyle w:val="881"/>
+        <w:pBdr/>
+        <w:spacing/>
+        <w:ind/>
         <w:rPr>
           <w:highlight w:val="none"/>
         </w:rPr>
-      </w:r>
-    </w:p>
-    <w:p>
-      <w:pPr>
-        <w:pStyle w:val="881"/>
-        <w:pBdr/>
-        <w:spacing/>
-        <w:ind/>
-        <w:rPr>
-          <w:highlight w:val="none"/>
-        </w:rPr>
       </w:pPr>
       <w:r/>
-      <w:bookmarkStart w:id="1" w:name="_Toc1"/>
+      <w:bookmarkStart w:id="17" w:name="_Toc1"/>
+      <w:r/>
       <w:r>
         <w:rPr>
           <w:b w:val="0"/>
@@ -1226,12 +1577,8 @@
         </w:rPr>
         <w:t xml:space="preserve">Úvod</w:t>
       </w:r>
-      <w:r>
-        <w:rPr>
-          <w:highlight w:val="none"/>
-        </w:rPr>
-      </w:r>
-      <w:bookmarkEnd w:id="1"/>
+      <w:r/>
+      <w:bookmarkEnd w:id="17"/>
       <w:r/>
       <w:r>
         <w:rPr>
@@ -1287,7 +1634,8 @@
         <w:rPr/>
       </w:pPr>
       <w:r/>
-      <w:bookmarkStart w:id="2" w:name="_Toc2"/>
+      <w:bookmarkStart w:id="18" w:name="_Toc2"/>
+      <w:r/>
       <w:r>
         <w:rPr>
           <w:b w:val="0"/>
@@ -1298,7 +1646,7 @@
         <w:t xml:space="preserve">Zadání webové aplikace</w:t>
       </w:r>
       <w:r/>
-      <w:bookmarkEnd w:id="2"/>
+      <w:bookmarkEnd w:id="18"/>
       <w:r/>
       <w:r/>
     </w:p>
@@ -1396,10 +1744,1787 @@
         <w:pBdr/>
         <w:spacing/>
         <w:ind/>
+        <w:rPr>
+          <w:b w:val="0"/>
+          <w:bCs w:val="0"/>
+          <w:highlight w:val="none"/>
+        </w:rPr>
+      </w:pPr>
+      <w:r/>
+      <w:bookmarkStart w:id="19" w:name="_Toc3"/>
+      <w:r>
+        <w:rPr>
+          <w:b w:val="0"/>
+          <w:bCs w:val="0"/>
+          <w:highlight w:val="none"/>
+          <w:lang w:val="cs-CZ"/>
+        </w:rPr>
+        <w:t xml:space="preserve">Popis funkcinality aplikace</w:t>
+      </w:r>
+      <w:r/>
+      <w:bookmarkEnd w:id="19"/>
+      <w:r/>
+      <w:r>
+        <w:rPr>
+          <w:b w:val="0"/>
+          <w:bCs w:val="0"/>
+          <w:highlight w:val="none"/>
+        </w:rPr>
+      </w:r>
+    </w:p>
+    <w:p>
+      <w:pPr>
+        <w:pBdr/>
+        <w:spacing/>
+        <w:ind/>
+        <w:rPr>
+          <w:b w:val="0"/>
+          <w:bCs w:val="0"/>
+          <w:highlight w:val="none"/>
+          <w:lang w:val="cs-CZ"/>
+        </w:rPr>
+      </w:pPr>
+      <w:r>
+        <w:rPr>
+          <w:b w:val="0"/>
+          <w:bCs w:val="0"/>
+          <w:highlight w:val="none"/>
+          <w:lang w:val="cs-CZ"/>
+        </w:rPr>
+      </w:r>
+      <w:r>
+        <w:rPr>
+          <w:b w:val="0"/>
+          <w:bCs w:val="0"/>
+          <w:highlight w:val="none"/>
+          <w:lang w:val="cs-CZ"/>
+        </w:rPr>
+        <w:t xml:space="preserve">Webová e-commerce aplikace pro objednávání zmrzliny online. Zákazník si vybere pobočku, přidá produkty do košíku nebo si sestaví vlastní zmrzlinu pomocí konfigurátoru, a odešle objednávku k vyzvednutí.</w:t>
+      </w:r>
+      <w:r/>
+    </w:p>
+    <w:p>
+      <w:pPr>
+        <w:pStyle w:val="882"/>
+        <w:pBdr/>
+        <w:spacing/>
+        <w:ind/>
         <w:rPr/>
       </w:pPr>
       <w:r/>
-      <w:bookmarkStart w:id="3" w:name="_Toc3"/>
+      <w:bookmarkStart w:id="20" w:name="_Toc4"/>
+      <w:r/>
+      <w:bookmarkStart w:id="15" w:name="_Uživatelsk"/>
+      <w:r/>
+      <w:bookmarkEnd w:id="15"/>
+      <w:r>
+        <w:rPr>
+          <w:b w:val="0"/>
+          <w:bCs w:val="0"/>
+          <w:highlight w:val="none"/>
+          <w:lang w:val="cs-CZ"/>
+        </w:rPr>
+        <w:t xml:space="preserve">Uživatelské role</w:t>
+      </w:r>
+      <w:r/>
+      <w:bookmarkEnd w:id="20"/>
+      <w:r/>
+      <w:r/>
+    </w:p>
+    <w:p>
+      <w:pPr>
+        <w:pBdr/>
+        <w:spacing/>
+        <w:ind/>
+        <w:rPr>
+          <w:b w:val="0"/>
+          <w:bCs w:val="0"/>
+          <w:highlight w:val="none"/>
+          <w:lang w:val="cs-CZ"/>
+        </w:rPr>
+      </w:pPr>
+      <w:r>
+        <w:rPr>
+          <w:b w:val="0"/>
+          <w:bCs w:val="0"/>
+          <w:highlight w:val="none"/>
+          <w:lang w:val="cs-CZ"/>
+        </w:rPr>
+        <w:t xml:space="preserve">Uživatel může nabývat tří rolý </w:t>
+      </w:r>
+      <w:r>
+        <w:rPr>
+          <w:b/>
+          <w:bCs/>
+          <w:highlight w:val="none"/>
+          <w:lang w:val="cs-CZ"/>
+        </w:rPr>
+        <w:t xml:space="preserve">nepřihlášený uživatel</w:t>
+      </w:r>
+      <w:r>
+        <w:rPr>
+          <w:b w:val="0"/>
+          <w:bCs w:val="0"/>
+          <w:highlight w:val="none"/>
+          <w:lang w:val="cs-CZ"/>
+        </w:rPr>
+        <w:t xml:space="preserve">, </w:t>
+      </w:r>
+      <w:r>
+        <w:rPr>
+          <w:b/>
+          <w:bCs/>
+          <w:highlight w:val="none"/>
+          <w:lang w:val="cs-CZ"/>
+        </w:rPr>
+        <w:t xml:space="preserve">přihlášený uživatel</w:t>
+      </w:r>
+      <w:r>
+        <w:rPr>
+          <w:b w:val="0"/>
+          <w:bCs w:val="0"/>
+          <w:highlight w:val="none"/>
+          <w:lang w:val="cs-CZ"/>
+        </w:rPr>
+        <w:t xml:space="preserve"> a </w:t>
+      </w:r>
+      <w:r>
+        <w:rPr>
+          <w:b/>
+          <w:bCs/>
+          <w:highlight w:val="none"/>
+          <w:lang w:val="cs-CZ"/>
+        </w:rPr>
+        <w:t xml:space="preserve">admin</w:t>
+      </w:r>
+      <w:r>
+        <w:rPr>
+          <w:b w:val="0"/>
+          <w:bCs w:val="0"/>
+          <w:highlight w:val="none"/>
+          <w:lang w:val="cs-CZ"/>
+        </w:rPr>
+        <w:t xml:space="preserve">, kde každá role přidává uživateli nové funkcionality</w:t>
+      </w:r>
+      <w:r>
+        <w:rPr>
+          <w:b w:val="0"/>
+          <w:bCs w:val="0"/>
+        </w:rPr>
+      </w:r>
+    </w:p>
+    <w:p>
+      <w:pPr>
+        <w:pStyle w:val="944"/>
+        <w:numPr>
+          <w:ilvl w:val="0"/>
+          <w:numId w:val="4"/>
+        </w:numPr>
+        <w:pBdr/>
+        <w:spacing/>
+        <w:ind/>
+        <w:rPr>
+          <w:b w:val="0"/>
+          <w:bCs w:val="0"/>
+        </w:rPr>
+      </w:pPr>
+      <w:r>
+        <w:rPr>
+          <w:b w:val="0"/>
+          <w:bCs w:val="0"/>
+          <w:highlight w:val="none"/>
+          <w:lang w:val="cs-CZ"/>
+        </w:rPr>
+        <w:t xml:space="preserve">Nepřihlášený uživatel = možnost objednání zmrzliny, konfigurátor zmrzliny, filtrace nabýdky a kvíz</w:t>
+      </w:r>
+      <w:r>
+        <w:rPr>
+          <w:b w:val="0"/>
+          <w:bCs w:val="0"/>
+        </w:rPr>
+      </w:r>
+    </w:p>
+    <w:p>
+      <w:pPr>
+        <w:pStyle w:val="944"/>
+        <w:numPr>
+          <w:ilvl w:val="0"/>
+          <w:numId w:val="4"/>
+        </w:numPr>
+        <w:pBdr/>
+        <w:spacing/>
+        <w:ind/>
+        <w:rPr>
+          <w:b w:val="0"/>
+          <w:bCs w:val="0"/>
+        </w:rPr>
+      </w:pPr>
+      <w:r>
+        <w:rPr>
+          <w:b w:val="0"/>
+          <w:bCs w:val="0"/>
+          <w:highlight w:val="none"/>
+          <w:lang w:val="cs-CZ"/>
+        </w:rPr>
+        <w:t xml:space="preserve">Přihlášený uživatel = uchovávání objednávek, předvyplnění informací u objednávání</w:t>
+      </w:r>
+      <w:r>
+        <w:rPr>
+          <w:b w:val="0"/>
+          <w:bCs w:val="0"/>
+        </w:rPr>
+      </w:r>
+    </w:p>
+    <w:p>
+      <w:pPr>
+        <w:pStyle w:val="944"/>
+        <w:numPr>
+          <w:ilvl w:val="0"/>
+          <w:numId w:val="4"/>
+        </w:numPr>
+        <w:pBdr/>
+        <w:spacing/>
+        <w:ind/>
+        <w:rPr>
+          <w:b w:val="0"/>
+          <w:bCs w:val="0"/>
+        </w:rPr>
+      </w:pPr>
+      <w:r>
+        <w:rPr>
+          <w:b w:val="0"/>
+          <w:bCs w:val="0"/>
+          <w:highlight w:val="none"/>
+          <w:lang w:val="cs-CZ"/>
+        </w:rPr>
+        <w:t xml:space="preserve">Admin = dashboard, správá produktů a kamenných prodejen</w:t>
+      </w:r>
+      <w:r>
+        <w:rPr>
+          <w:b w:val="0"/>
+          <w:bCs w:val="0"/>
+        </w:rPr>
+      </w:r>
+    </w:p>
+    <w:p>
+      <w:pPr>
+        <w:pBdr/>
+        <w:spacing/>
+        <w:ind/>
+        <w:rPr>
+          <w:b w:val="0"/>
+          <w:bCs w:val="0"/>
+          <w:highlight w:val="none"/>
+          <w:lang w:val="cs-CZ"/>
+        </w:rPr>
+      </w:pPr>
+      <w:r>
+        <w:rPr>
+          <w:b w:val="0"/>
+          <w:bCs w:val="0"/>
+          <w:highlight w:val="none"/>
+          <w:lang w:val="cs-CZ"/>
+        </w:rPr>
+        <w:t xml:space="preserve">Testovatelské účty jsou:</w:t>
+      </w:r>
+      <w:r>
+        <w:rPr>
+          <w:b w:val="0"/>
+          <w:bCs w:val="0"/>
+        </w:rPr>
+      </w:r>
+    </w:p>
+    <w:p>
+      <w:pPr>
+        <w:pStyle w:val="944"/>
+        <w:numPr>
+          <w:ilvl w:val="0"/>
+          <w:numId w:val="5"/>
+        </w:numPr>
+        <w:pBdr/>
+        <w:spacing/>
+        <w:ind/>
+        <w:rPr>
+          <w:b w:val="0"/>
+          <w:bCs w:val="0"/>
+        </w:rPr>
+      </w:pPr>
+      <w:r>
+        <w:rPr>
+          <w:b w:val="0"/>
+          <w:bCs w:val="0"/>
+          <w:highlight w:val="none"/>
+          <w:lang w:val="cs-CZ"/>
+        </w:rPr>
+        <w:t xml:space="preserve">Admin:</w:t>
+      </w:r>
+      <w:r>
+        <w:rPr>
+          <w:b w:val="0"/>
+          <w:bCs w:val="0"/>
+        </w:rPr>
+      </w:r>
+    </w:p>
+    <w:p>
+      <w:pPr>
+        <w:pStyle w:val="944"/>
+        <w:numPr>
+          <w:ilvl w:val="1"/>
+          <w:numId w:val="5"/>
+        </w:numPr>
+        <w:pBdr/>
+        <w:spacing/>
+        <w:ind/>
+        <w:rPr>
+          <w:b w:val="0"/>
+          <w:bCs w:val="0"/>
+        </w:rPr>
+      </w:pPr>
+      <w:r>
+        <w:rPr>
+          <w:b w:val="0"/>
+          <w:bCs w:val="0"/>
+          <w:highlight w:val="none"/>
+          <w:lang w:val="cs-CZ"/>
+        </w:rPr>
+        <w:t xml:space="preserve">Username: </w:t>
+      </w:r>
+      <w:r>
+        <w:rPr>
+          <w:b/>
+          <w:bCs/>
+          <w:highlight w:val="none"/>
+          <w:lang w:val="cs-CZ"/>
+        </w:rPr>
+        <w:t xml:space="preserve">admin</w:t>
+      </w:r>
+      <w:r>
+        <w:rPr>
+          <w:b w:val="0"/>
+          <w:bCs w:val="0"/>
+          <w:highlight w:val="none"/>
+          <w:lang w:val="cs-CZ"/>
+        </w:rPr>
+      </w:r>
+      <w:r>
+        <w:rPr>
+          <w:b w:val="0"/>
+          <w:bCs w:val="0"/>
+        </w:rPr>
+      </w:r>
+    </w:p>
+    <w:p>
+      <w:pPr>
+        <w:pStyle w:val="944"/>
+        <w:numPr>
+          <w:ilvl w:val="1"/>
+          <w:numId w:val="5"/>
+        </w:numPr>
+        <w:pBdr/>
+        <w:spacing/>
+        <w:ind/>
+        <w:rPr>
+          <w:b w:val="0"/>
+          <w:bCs w:val="0"/>
+        </w:rPr>
+      </w:pPr>
+      <w:r>
+        <w:rPr>
+          <w:b w:val="0"/>
+          <w:bCs w:val="0"/>
+          <w:highlight w:val="none"/>
+          <w:lang w:val="cs-CZ"/>
+        </w:rPr>
+        <w:t xml:space="preserve">Heslo: </w:t>
+      </w:r>
+      <w:r>
+        <w:rPr>
+          <w:b/>
+          <w:bCs/>
+          <w:highlight w:val="none"/>
+          <w:lang w:val="cs-CZ"/>
+        </w:rPr>
+        <w:t xml:space="preserve">admin123</w:t>
+      </w:r>
+      <w:r>
+        <w:rPr>
+          <w:b w:val="0"/>
+          <w:bCs w:val="0"/>
+          <w:highlight w:val="none"/>
+          <w:lang w:val="cs-CZ"/>
+        </w:rPr>
+      </w:r>
+      <w:r>
+        <w:rPr>
+          <w:b w:val="0"/>
+          <w:bCs w:val="0"/>
+        </w:rPr>
+      </w:r>
+    </w:p>
+    <w:p>
+      <w:pPr>
+        <w:pStyle w:val="944"/>
+        <w:numPr>
+          <w:ilvl w:val="0"/>
+          <w:numId w:val="5"/>
+        </w:numPr>
+        <w:pBdr/>
+        <w:spacing/>
+        <w:ind/>
+        <w:rPr>
+          <w:b w:val="0"/>
+          <w:bCs w:val="0"/>
+        </w:rPr>
+      </w:pPr>
+      <w:r>
+        <w:rPr>
+          <w:b w:val="0"/>
+          <w:bCs w:val="0"/>
+          <w:highlight w:val="none"/>
+          <w:lang w:val="cs-CZ"/>
+        </w:rPr>
+        <w:t xml:space="preserve">Uživatel:</w:t>
+      </w:r>
+      <w:r>
+        <w:rPr>
+          <w:b w:val="0"/>
+          <w:bCs w:val="0"/>
+        </w:rPr>
+      </w:r>
+    </w:p>
+    <w:p>
+      <w:pPr>
+        <w:pStyle w:val="944"/>
+        <w:numPr>
+          <w:ilvl w:val="1"/>
+          <w:numId w:val="5"/>
+        </w:numPr>
+        <w:pBdr/>
+        <w:spacing/>
+        <w:ind/>
+        <w:rPr>
+          <w:b w:val="0"/>
+          <w:bCs w:val="0"/>
+        </w:rPr>
+      </w:pPr>
+      <w:r>
+        <w:rPr>
+          <w:b w:val="0"/>
+          <w:bCs w:val="0"/>
+          <w:highlight w:val="none"/>
+          <w:lang w:val="cs-CZ"/>
+        </w:rPr>
+        <w:t xml:space="preserve">Username: </w:t>
+      </w:r>
+      <w:r>
+        <w:rPr>
+          <w:b/>
+          <w:bCs/>
+          <w:highlight w:val="none"/>
+          <w:lang w:val="cs-CZ"/>
+        </w:rPr>
+        <w:t xml:space="preserve">jan</w:t>
+      </w:r>
+      <w:r>
+        <w:rPr>
+          <w:b w:val="0"/>
+          <w:bCs w:val="0"/>
+          <w:highlight w:val="none"/>
+          <w:lang w:val="cs-CZ"/>
+        </w:rPr>
+      </w:r>
+      <w:r>
+        <w:rPr>
+          <w:b w:val="0"/>
+          <w:bCs w:val="0"/>
+        </w:rPr>
+      </w:r>
+    </w:p>
+    <w:p>
+      <w:pPr>
+        <w:pStyle w:val="944"/>
+        <w:numPr>
+          <w:ilvl w:val="1"/>
+          <w:numId w:val="5"/>
+        </w:numPr>
+        <w:pBdr/>
+        <w:spacing/>
+        <w:ind/>
+        <w:rPr>
+          <w:b w:val="0"/>
+          <w:bCs w:val="0"/>
+        </w:rPr>
+      </w:pPr>
+      <w:r>
+        <w:rPr>
+          <w:b w:val="0"/>
+          <w:bCs w:val="0"/>
+          <w:highlight w:val="none"/>
+          <w:lang w:val="cs-CZ"/>
+        </w:rPr>
+        <w:t xml:space="preserve">Heslo: </w:t>
+      </w:r>
+      <w:r>
+        <w:rPr>
+          <w:b/>
+          <w:bCs/>
+          <w:highlight w:val="none"/>
+          <w:lang w:val="cs-CZ"/>
+        </w:rPr>
+        <w:t xml:space="preserve">jan123</w:t>
+      </w:r>
+      <w:r>
+        <w:rPr>
+          <w:b w:val="0"/>
+          <w:bCs w:val="0"/>
+        </w:rPr>
+      </w:r>
+    </w:p>
+    <w:p>
+      <w:pPr>
+        <w:pStyle w:val="882"/>
+        <w:pBdr/>
+        <w:spacing/>
+        <w:ind/>
+        <w:rPr>
+          <w:b w:val="0"/>
+          <w:bCs w:val="0"/>
+        </w:rPr>
+      </w:pPr>
+      <w:r/>
+      <w:bookmarkStart w:id="21" w:name="_Toc5"/>
+      <w:r/>
+      <w:bookmarkStart w:id="16" w:name="_Zákaznická"/>
+      <w:r/>
+      <w:bookmarkEnd w:id="16"/>
+      <w:r>
+        <w:rPr>
+          <w:b w:val="0"/>
+          <w:bCs w:val="0"/>
+          <w:highlight w:val="none"/>
+          <w:lang w:val="cs-CZ"/>
+        </w:rPr>
+        <w:t xml:space="preserve">Zákaznická část</w:t>
+      </w:r>
+      <w:r/>
+      <w:bookmarkEnd w:id="21"/>
+      <w:r/>
+      <w:r>
+        <w:rPr>
+          <w:b w:val="0"/>
+          <w:bCs w:val="0"/>
+          <w:highlight w:val="none"/>
+          <w:lang w:val="cs-CZ"/>
+        </w:rPr>
+      </w:r>
+    </w:p>
+    <w:tbl>
+      <w:tblPr>
+        <w:tblStyle w:val="755"/>
+        <w:tblW w:w="0" w:type="auto"/>
+        <w:tblBorders/>
+        <w:tblLook w:val="04A0" w:firstRow="1" w:lastRow="0" w:firstColumn="1" w:lastColumn="0" w:noHBand="0" w:noVBand="1"/>
+      </w:tblPr>
+      <w:tblGrid>
+        <w:gridCol w:w="4513"/>
+        <w:gridCol w:w="4513"/>
+      </w:tblGrid>
+      <w:tr>
+        <w:trPr>
+          <w:trHeight w:val="202"/>
+        </w:trPr>
+        <w:tc>
+          <w:tcPr>
+            <w:tcBorders/>
+            <w:tcW w:w="4513" w:type="dxa"/>
+            <w:textDirection w:val="lrTb"/>
+            <w:noWrap w:val="false"/>
+          </w:tcPr>
+          <w:p>
+            <w:pPr>
+              <w:pBdr/>
+              <w:spacing/>
+              <w:ind/>
+              <w:rPr>
+                <w:b w:val="0"/>
+                <w:bCs w:val="0"/>
+                <w:highlight w:val="darkBlue"/>
+              </w:rPr>
+            </w:pPr>
+            <w:r>
+              <w:rPr>
+                <w:b w:val="0"/>
+                <w:bCs w:val="0"/>
+                <w:highlight w:val="none"/>
+                <w:lang w:val="cs-CZ"/>
+              </w:rPr>
+              <w:t xml:space="preserve">Hlavní stránka</w:t>
+            </w:r>
+            <w:r>
+              <w:rPr>
+                <w:b w:val="0"/>
+                <w:bCs w:val="0"/>
+                <w:highlight w:val="darkBlue"/>
+                <w:lang w:val="cs-CZ"/>
+              </w:rPr>
+            </w:r>
+            <w:r>
+              <w:rPr>
+                <w:b w:val="0"/>
+                <w:bCs w:val="0"/>
+                <w:highlight w:val="darkBlue"/>
+              </w:rPr>
+            </w:r>
+          </w:p>
+        </w:tc>
+        <w:tc>
+          <w:tcPr>
+            <w:tcBorders/>
+            <w:tcW w:w="4513" w:type="dxa"/>
+            <w:textDirection w:val="lrTb"/>
+            <w:noWrap w:val="false"/>
+          </w:tcPr>
+          <w:p>
+            <w:pPr>
+              <w:pBdr/>
+              <w:spacing/>
+              <w:ind/>
+              <w:rPr>
+                <w:b w:val="0"/>
+                <w:bCs w:val="0"/>
+                <w:highlight w:val="darkBlue"/>
+              </w:rPr>
+            </w:pPr>
+            <w:r>
+              <w:rPr>
+                <w:b w:val="0"/>
+                <w:bCs w:val="0"/>
+                <w:highlight w:val="none"/>
+                <w:lang w:val="cs-CZ"/>
+              </w:rPr>
+              <w:t xml:space="preserve">/</w:t>
+            </w:r>
+            <w:r>
+              <w:rPr>
+                <w:b w:val="0"/>
+                <w:bCs w:val="0"/>
+                <w:highlight w:val="darkBlue"/>
+                <w:lang w:val="cs-CZ"/>
+              </w:rPr>
+            </w:r>
+            <w:r>
+              <w:rPr>
+                <w:b w:val="0"/>
+                <w:bCs w:val="0"/>
+                <w:highlight w:val="darkBlue"/>
+              </w:rPr>
+            </w:r>
+          </w:p>
+        </w:tc>
+      </w:tr>
+      <w:tr>
+        <w:trPr/>
+        <w:tc>
+          <w:tcPr>
+            <w:tcBorders/>
+            <w:tcW w:w="4513" w:type="dxa"/>
+            <w:textDirection w:val="lrTb"/>
+            <w:noWrap w:val="false"/>
+          </w:tcPr>
+          <w:p>
+            <w:pPr>
+              <w:pBdr/>
+              <w:spacing/>
+              <w:ind/>
+              <w:rPr>
+                <w:b w:val="0"/>
+                <w:bCs w:val="0"/>
+                <w:highlight w:val="none"/>
+              </w:rPr>
+            </w:pPr>
+            <w:r>
+              <w:rPr>
+                <w:b w:val="0"/>
+                <w:bCs w:val="0"/>
+                <w:highlight w:val="none"/>
+                <w:lang w:val="cs-CZ"/>
+              </w:rPr>
+              <w:t xml:space="preserve">Detail zmrzlinárny</w:t>
+            </w:r>
+            <w:r>
+              <w:rPr>
+                <w:b w:val="0"/>
+                <w:bCs w:val="0"/>
+                <w:highlight w:val="none"/>
+              </w:rPr>
+            </w:r>
+          </w:p>
+        </w:tc>
+        <w:tc>
+          <w:tcPr>
+            <w:tcBorders/>
+            <w:tcW w:w="4513" w:type="dxa"/>
+            <w:textDirection w:val="lrTb"/>
+            <w:noWrap w:val="false"/>
+          </w:tcPr>
+          <w:p>
+            <w:pPr>
+              <w:pBdr/>
+              <w:spacing/>
+              <w:ind/>
+              <w:rPr>
+                <w:b w:val="0"/>
+                <w:bCs w:val="0"/>
+                <w:highlight w:val="none"/>
+                <w:lang w:val="cs-CZ"/>
+              </w:rPr>
+            </w:pPr>
+            <w:r>
+              <w:rPr>
+                <w:b w:val="0"/>
+                <w:bCs w:val="0"/>
+                <w:highlight w:val="none"/>
+                <w:lang w:val="cs-CZ"/>
+              </w:rPr>
+              <w:t xml:space="preserve">/shop/{id}</w:t>
+            </w:r>
+            <w:r>
+              <w:rPr>
+                <w:b w:val="0"/>
+                <w:bCs w:val="0"/>
+                <w:highlight w:val="none"/>
+              </w:rPr>
+            </w:r>
+            <w:r>
+              <w:rPr>
+                <w:b w:val="0"/>
+                <w:bCs w:val="0"/>
+                <w:highlight w:val="none"/>
+                <w:lang w:val="cs-CZ"/>
+              </w:rPr>
+            </w:r>
+            <w:r>
+              <w:rPr>
+                <w:b w:val="0"/>
+                <w:bCs w:val="0"/>
+                <w:highlight w:val="none"/>
+                <w:lang w:val="cs-CZ"/>
+              </w:rPr>
+            </w:r>
+            <w:r>
+              <w:rPr>
+                <w:b w:val="0"/>
+                <w:bCs w:val="0"/>
+                <w:highlight w:val="none"/>
+                <w:lang w:val="cs-CZ"/>
+              </w:rPr>
+            </w:r>
+            <w:r>
+              <w:rPr>
+                <w:b w:val="0"/>
+                <w:bCs w:val="0"/>
+                <w:highlight w:val="none"/>
+                <w:lang w:val="cs-CZ"/>
+              </w:rPr>
+            </w:r>
+          </w:p>
+        </w:tc>
+      </w:tr>
+      <w:tr>
+        <w:trPr/>
+        <w:tc>
+          <w:tcPr>
+            <w:tcBorders/>
+            <w:tcW w:w="4513" w:type="dxa"/>
+            <w:vMerge w:val="restart"/>
+            <w:textDirection w:val="lrTb"/>
+            <w:noWrap w:val="false"/>
+          </w:tcPr>
+          <w:p>
+            <w:pPr>
+              <w:pBdr/>
+              <w:spacing/>
+              <w:ind/>
+              <w:rPr>
+                <w:b w:val="0"/>
+                <w:bCs w:val="0"/>
+                <w:highlight w:val="none"/>
+                <w:lang w:val="cs-CZ"/>
+              </w:rPr>
+            </w:pPr>
+            <w:r>
+              <w:rPr>
+                <w:b w:val="0"/>
+                <w:bCs w:val="0"/>
+                <w:highlight w:val="none"/>
+                <w:lang w:val="cs-CZ"/>
+              </w:rPr>
+              <w:t xml:space="preserve">Košík</w:t>
+            </w:r>
+            <w:r>
+              <w:rPr>
+                <w:b w:val="0"/>
+                <w:bCs w:val="0"/>
+                <w:highlight w:val="none"/>
+                <w:lang w:val="cs-CZ"/>
+              </w:rPr>
+            </w:r>
+          </w:p>
+        </w:tc>
+        <w:tc>
+          <w:tcPr>
+            <w:tcBorders/>
+            <w:tcW w:w="4513" w:type="dxa"/>
+            <w:vMerge w:val="restart"/>
+            <w:textDirection w:val="lrTb"/>
+            <w:noWrap w:val="false"/>
+          </w:tcPr>
+          <w:p>
+            <w:pPr>
+              <w:pBdr/>
+              <w:spacing/>
+              <w:ind/>
+              <w:rPr>
+                <w:b w:val="0"/>
+                <w:bCs w:val="0"/>
+                <w:highlight w:val="none"/>
+                <w:lang w:val="cs-CZ"/>
+              </w:rPr>
+            </w:pPr>
+            <w:r>
+              <w:rPr>
+                <w:b w:val="0"/>
+                <w:bCs w:val="0"/>
+                <w:highlight w:val="none"/>
+                <w:lang w:val="cs-CZ"/>
+              </w:rPr>
+              <w:t xml:space="preserve">/cart</w:t>
+            </w:r>
+            <w:r>
+              <w:rPr>
+                <w:b w:val="0"/>
+                <w:bCs w:val="0"/>
+                <w:highlight w:val="none"/>
+                <w:lang w:val="cs-CZ"/>
+              </w:rPr>
+            </w:r>
+          </w:p>
+        </w:tc>
+      </w:tr>
+      <w:tr>
+        <w:trPr/>
+        <w:tc>
+          <w:tcPr>
+            <w:tcBorders/>
+            <w:tcW w:w="4513" w:type="dxa"/>
+            <w:vMerge w:val="restart"/>
+            <w:textDirection w:val="lrTb"/>
+            <w:noWrap w:val="false"/>
+          </w:tcPr>
+          <w:p>
+            <w:pPr>
+              <w:pBdr/>
+              <w:spacing/>
+              <w:ind/>
+              <w:rPr>
+                <w:b w:val="0"/>
+                <w:bCs w:val="0"/>
+                <w:highlight w:val="none"/>
+                <w:lang w:val="cs-CZ"/>
+              </w:rPr>
+            </w:pPr>
+            <w:r>
+              <w:rPr>
+                <w:b w:val="0"/>
+                <w:bCs w:val="0"/>
+                <w:highlight w:val="none"/>
+                <w:lang w:val="cs-CZ"/>
+              </w:rPr>
+              <w:t xml:space="preserve">Konfigurátor zmrzliny</w:t>
+            </w:r>
+            <w:r>
+              <w:rPr>
+                <w:b w:val="0"/>
+                <w:bCs w:val="0"/>
+                <w:highlight w:val="none"/>
+                <w:lang w:val="cs-CZ"/>
+              </w:rPr>
+            </w:r>
+          </w:p>
+        </w:tc>
+        <w:tc>
+          <w:tcPr>
+            <w:tcBorders/>
+            <w:tcW w:w="4513" w:type="dxa"/>
+            <w:vMerge w:val="restart"/>
+            <w:textDirection w:val="lrTb"/>
+            <w:noWrap w:val="false"/>
+          </w:tcPr>
+          <w:p>
+            <w:pPr>
+              <w:pBdr/>
+              <w:spacing/>
+              <w:ind/>
+              <w:rPr>
+                <w:b w:val="0"/>
+                <w:bCs w:val="0"/>
+                <w:highlight w:val="none"/>
+                <w:lang w:val="cs-CZ"/>
+              </w:rPr>
+            </w:pPr>
+            <w:r>
+              <w:rPr>
+                <w:b w:val="0"/>
+                <w:bCs w:val="0"/>
+                <w:highlight w:val="none"/>
+                <w:lang w:val="cs-CZ"/>
+              </w:rPr>
+              <w:t xml:space="preserve">/configurator</w:t>
+            </w:r>
+            <w:r>
+              <w:rPr>
+                <w:b w:val="0"/>
+                <w:bCs w:val="0"/>
+                <w:highlight w:val="none"/>
+                <w:lang w:val="cs-CZ"/>
+              </w:rPr>
+            </w:r>
+          </w:p>
+        </w:tc>
+      </w:tr>
+      <w:tr>
+        <w:trPr/>
+        <w:tc>
+          <w:tcPr>
+            <w:tcBorders/>
+            <w:tcW w:w="4513" w:type="dxa"/>
+            <w:vMerge w:val="restart"/>
+            <w:textDirection w:val="lrTb"/>
+            <w:noWrap w:val="false"/>
+          </w:tcPr>
+          <w:p>
+            <w:pPr>
+              <w:pBdr/>
+              <w:spacing/>
+              <w:ind/>
+              <w:rPr>
+                <w:b w:val="0"/>
+                <w:bCs w:val="0"/>
+                <w:highlight w:val="none"/>
+                <w:lang w:val="cs-CZ"/>
+              </w:rPr>
+            </w:pPr>
+            <w:r>
+              <w:rPr>
+                <w:b w:val="0"/>
+                <w:bCs w:val="0"/>
+                <w:highlight w:val="none"/>
+                <w:lang w:val="cs-CZ"/>
+              </w:rPr>
+              <w:t xml:space="preserve">Pokladna</w:t>
+            </w:r>
+            <w:r>
+              <w:rPr>
+                <w:b w:val="0"/>
+                <w:bCs w:val="0"/>
+                <w:highlight w:val="none"/>
+                <w:lang w:val="cs-CZ"/>
+              </w:rPr>
+            </w:r>
+          </w:p>
+        </w:tc>
+        <w:tc>
+          <w:tcPr>
+            <w:tcBorders/>
+            <w:tcW w:w="4513" w:type="dxa"/>
+            <w:vMerge w:val="restart"/>
+            <w:textDirection w:val="lrTb"/>
+            <w:noWrap w:val="false"/>
+          </w:tcPr>
+          <w:p>
+            <w:pPr>
+              <w:pBdr/>
+              <w:spacing/>
+              <w:ind/>
+              <w:rPr>
+                <w:b w:val="0"/>
+                <w:bCs w:val="0"/>
+                <w:highlight w:val="none"/>
+                <w:lang w:val="cs-CZ"/>
+              </w:rPr>
+            </w:pPr>
+            <w:r>
+              <w:rPr>
+                <w:b w:val="0"/>
+                <w:bCs w:val="0"/>
+                <w:highlight w:val="none"/>
+                <w:lang w:val="cs-CZ"/>
+              </w:rPr>
+              <w:t xml:space="preserve">/order/checkout</w:t>
+            </w:r>
+            <w:r>
+              <w:rPr>
+                <w:b w:val="0"/>
+                <w:bCs w:val="0"/>
+                <w:highlight w:val="none"/>
+                <w:lang w:val="cs-CZ"/>
+              </w:rPr>
+            </w:r>
+          </w:p>
+        </w:tc>
+      </w:tr>
+      <w:tr>
+        <w:trPr/>
+        <w:tc>
+          <w:tcPr>
+            <w:tcBorders/>
+            <w:tcW w:w="4513" w:type="dxa"/>
+            <w:vMerge w:val="restart"/>
+            <w:textDirection w:val="lrTb"/>
+            <w:noWrap w:val="false"/>
+          </w:tcPr>
+          <w:p>
+            <w:pPr>
+              <w:pBdr/>
+              <w:spacing/>
+              <w:ind/>
+              <w:rPr>
+                <w:b w:val="0"/>
+                <w:bCs w:val="0"/>
+                <w:highlight w:val="none"/>
+                <w:lang w:val="cs-CZ"/>
+              </w:rPr>
+            </w:pPr>
+            <w:r>
+              <w:rPr>
+                <w:b w:val="0"/>
+                <w:bCs w:val="0"/>
+                <w:highlight w:val="none"/>
+                <w:lang w:val="cs-CZ"/>
+              </w:rPr>
+              <w:t xml:space="preserve">Potvrzení objednávky</w:t>
+            </w:r>
+            <w:r>
+              <w:rPr>
+                <w:b w:val="0"/>
+                <w:bCs w:val="0"/>
+                <w:highlight w:val="none"/>
+                <w:lang w:val="cs-CZ"/>
+              </w:rPr>
+            </w:r>
+          </w:p>
+        </w:tc>
+        <w:tc>
+          <w:tcPr>
+            <w:tcBorders/>
+            <w:tcW w:w="4513" w:type="dxa"/>
+            <w:vMerge w:val="restart"/>
+            <w:textDirection w:val="lrTb"/>
+            <w:noWrap w:val="false"/>
+          </w:tcPr>
+          <w:p>
+            <w:pPr>
+              <w:pBdr/>
+              <w:spacing/>
+              <w:ind/>
+              <w:rPr>
+                <w:b w:val="0"/>
+                <w:bCs w:val="0"/>
+                <w:highlight w:val="none"/>
+                <w:lang w:val="cs-CZ"/>
+              </w:rPr>
+            </w:pPr>
+            <w:r>
+              <w:rPr>
+                <w:b w:val="0"/>
+                <w:bCs w:val="0"/>
+                <w:highlight w:val="none"/>
+                <w:lang w:val="cs-CZ"/>
+              </w:rPr>
+              <w:t xml:space="preserve">/order/confirmation</w:t>
+            </w:r>
+            <w:r>
+              <w:rPr>
+                <w:b w:val="0"/>
+                <w:bCs w:val="0"/>
+                <w:highlight w:val="none"/>
+                <w:lang w:val="cs-CZ"/>
+              </w:rPr>
+            </w:r>
+          </w:p>
+        </w:tc>
+      </w:tr>
+      <w:tr>
+        <w:trPr/>
+        <w:tc>
+          <w:tcPr>
+            <w:tcBorders/>
+            <w:tcW w:w="4513" w:type="dxa"/>
+            <w:vMerge w:val="restart"/>
+            <w:textDirection w:val="lrTb"/>
+            <w:noWrap w:val="false"/>
+          </w:tcPr>
+          <w:p>
+            <w:pPr>
+              <w:pBdr/>
+              <w:spacing/>
+              <w:ind/>
+              <w:rPr>
+                <w:b w:val="0"/>
+                <w:bCs w:val="0"/>
+                <w:highlight w:val="none"/>
+                <w:lang w:val="cs-CZ"/>
+              </w:rPr>
+            </w:pPr>
+            <w:r>
+              <w:rPr>
+                <w:b w:val="0"/>
+                <w:bCs w:val="0"/>
+                <w:highlight w:val="none"/>
+                <w:lang w:val="cs-CZ"/>
+              </w:rPr>
+              <w:t xml:space="preserve">Moje objednávky</w:t>
+            </w:r>
+            <w:r>
+              <w:rPr>
+                <w:b w:val="0"/>
+                <w:bCs w:val="0"/>
+                <w:highlight w:val="none"/>
+                <w:lang w:val="cs-CZ"/>
+              </w:rPr>
+            </w:r>
+          </w:p>
+        </w:tc>
+        <w:tc>
+          <w:tcPr>
+            <w:tcBorders/>
+            <w:tcW w:w="4513" w:type="dxa"/>
+            <w:vMerge w:val="restart"/>
+            <w:textDirection w:val="lrTb"/>
+            <w:noWrap w:val="false"/>
+          </w:tcPr>
+          <w:p>
+            <w:pPr>
+              <w:pBdr/>
+              <w:spacing/>
+              <w:ind/>
+              <w:rPr>
+                <w:b w:val="0"/>
+                <w:bCs w:val="0"/>
+                <w:highlight w:val="none"/>
+                <w:lang w:val="cs-CZ"/>
+              </w:rPr>
+            </w:pPr>
+            <w:r>
+              <w:rPr>
+                <w:b w:val="0"/>
+                <w:bCs w:val="0"/>
+                <w:highlight w:val="none"/>
+                <w:lang w:val="cs-CZ"/>
+              </w:rPr>
+              <w:t xml:space="preserve">/order/my-orders</w:t>
+            </w:r>
+            <w:r>
+              <w:rPr>
+                <w:b w:val="0"/>
+                <w:bCs w:val="0"/>
+                <w:highlight w:val="none"/>
+                <w:lang w:val="cs-CZ"/>
+              </w:rPr>
+            </w:r>
+          </w:p>
+        </w:tc>
+      </w:tr>
+      <w:tr>
+        <w:trPr/>
+        <w:tc>
+          <w:tcPr>
+            <w:tcBorders/>
+            <w:tcW w:w="4513" w:type="dxa"/>
+            <w:vMerge w:val="restart"/>
+            <w:textDirection w:val="lrTb"/>
+            <w:noWrap w:val="false"/>
+          </w:tcPr>
+          <w:p>
+            <w:pPr>
+              <w:pBdr/>
+              <w:spacing/>
+              <w:ind/>
+              <w:rPr>
+                <w:b w:val="0"/>
+                <w:bCs w:val="0"/>
+                <w:highlight w:val="none"/>
+                <w:lang w:val="cs-CZ"/>
+              </w:rPr>
+            </w:pPr>
+            <w:r>
+              <w:rPr>
+                <w:b w:val="0"/>
+                <w:bCs w:val="0"/>
+                <w:highlight w:val="none"/>
+                <w:lang w:val="cs-CZ"/>
+              </w:rPr>
+              <w:t xml:space="preserve">Registrace</w:t>
+            </w:r>
+            <w:r>
+              <w:rPr>
+                <w:b w:val="0"/>
+                <w:bCs w:val="0"/>
+                <w:highlight w:val="none"/>
+                <w:lang w:val="cs-CZ"/>
+              </w:rPr>
+            </w:r>
+          </w:p>
+        </w:tc>
+        <w:tc>
+          <w:tcPr>
+            <w:tcBorders/>
+            <w:tcW w:w="4513" w:type="dxa"/>
+            <w:vMerge w:val="restart"/>
+            <w:textDirection w:val="lrTb"/>
+            <w:noWrap w:val="false"/>
+          </w:tcPr>
+          <w:p>
+            <w:pPr>
+              <w:pBdr/>
+              <w:spacing/>
+              <w:ind/>
+              <w:rPr>
+                <w:b w:val="0"/>
+                <w:bCs w:val="0"/>
+                <w:highlight w:val="none"/>
+                <w:lang w:val="cs-CZ"/>
+              </w:rPr>
+            </w:pPr>
+            <w:r>
+              <w:rPr>
+                <w:b w:val="0"/>
+                <w:bCs w:val="0"/>
+                <w:highlight w:val="none"/>
+                <w:lang w:val="cs-CZ"/>
+              </w:rPr>
+              <w:t xml:space="preserve">/register</w:t>
+            </w:r>
+            <w:r>
+              <w:rPr>
+                <w:b w:val="0"/>
+                <w:bCs w:val="0"/>
+                <w:highlight w:val="none"/>
+                <w:lang w:val="cs-CZ"/>
+              </w:rPr>
+            </w:r>
+          </w:p>
+        </w:tc>
+      </w:tr>
+      <w:tr>
+        <w:trPr/>
+        <w:tc>
+          <w:tcPr>
+            <w:tcBorders/>
+            <w:tcW w:w="4513" w:type="dxa"/>
+            <w:vMerge w:val="restart"/>
+            <w:textDirection w:val="lrTb"/>
+            <w:noWrap w:val="false"/>
+          </w:tcPr>
+          <w:p>
+            <w:pPr>
+              <w:pBdr/>
+              <w:spacing/>
+              <w:ind/>
+              <w:rPr>
+                <w:b w:val="0"/>
+                <w:bCs w:val="0"/>
+                <w:highlight w:val="none"/>
+                <w:lang w:val="cs-CZ"/>
+              </w:rPr>
+            </w:pPr>
+            <w:r>
+              <w:rPr>
+                <w:b w:val="0"/>
+                <w:bCs w:val="0"/>
+                <w:highlight w:val="none"/>
+                <w:lang w:val="cs-CZ"/>
+              </w:rPr>
+              <w:t xml:space="preserve">Login</w:t>
+            </w:r>
+            <w:r>
+              <w:rPr>
+                <w:b w:val="0"/>
+                <w:bCs w:val="0"/>
+                <w:highlight w:val="none"/>
+                <w:lang w:val="cs-CZ"/>
+              </w:rPr>
+            </w:r>
+          </w:p>
+        </w:tc>
+        <w:tc>
+          <w:tcPr>
+            <w:tcBorders/>
+            <w:tcW w:w="4513" w:type="dxa"/>
+            <w:vMerge w:val="restart"/>
+            <w:textDirection w:val="lrTb"/>
+            <w:noWrap w:val="false"/>
+          </w:tcPr>
+          <w:p>
+            <w:pPr>
+              <w:pBdr/>
+              <w:spacing/>
+              <w:ind/>
+              <w:rPr>
+                <w:b w:val="0"/>
+                <w:bCs w:val="0"/>
+                <w:highlight w:val="none"/>
+                <w:lang w:val="cs-CZ"/>
+              </w:rPr>
+            </w:pPr>
+            <w:r>
+              <w:rPr>
+                <w:b w:val="0"/>
+                <w:bCs w:val="0"/>
+                <w:highlight w:val="none"/>
+                <w:lang w:val="cs-CZ"/>
+              </w:rPr>
+              <w:t xml:space="preserve">/login</w:t>
+            </w:r>
+            <w:r>
+              <w:rPr>
+                <w:b w:val="0"/>
+                <w:bCs w:val="0"/>
+                <w:highlight w:val="none"/>
+                <w:lang w:val="cs-CZ"/>
+              </w:rPr>
+            </w:r>
+          </w:p>
+        </w:tc>
+      </w:tr>
+    </w:tbl>
+    <w:p>
+      <w:pPr>
+        <w:pBdr/>
+        <w:spacing/>
+        <w:ind/>
+        <w:rPr/>
+      </w:pPr>
+      <w:r/>
+      <w:r/>
+      <w:r/>
+    </w:p>
+    <w:p>
+      <w:pPr>
+        <w:pStyle w:val="882"/>
+        <w:pBdr/>
+        <w:spacing/>
+        <w:ind/>
+        <w:rPr/>
+      </w:pPr>
+      <w:r/>
+      <w:bookmarkStart w:id="22" w:name="_Toc6"/>
+      <w:r>
+        <w:rPr>
+          <w:b w:val="0"/>
+          <w:bCs w:val="0"/>
+          <w:highlight w:val="none"/>
+          <w:lang w:val="cs-CZ"/>
+        </w:rPr>
+        <w:t xml:space="preserve">Administrátorská část</w:t>
+      </w:r>
+      <w:r/>
+      <w:bookmarkEnd w:id="22"/>
+      <w:r/>
+      <w:r/>
+    </w:p>
+    <w:tbl>
+      <w:tblPr>
+        <w:tblStyle w:val="755"/>
+        <w:tblW w:w="0" w:type="auto"/>
+        <w:tblBorders/>
+        <w:tblLook w:val="04A0" w:firstRow="1" w:lastRow="0" w:firstColumn="1" w:lastColumn="0" w:noHBand="0" w:noVBand="1"/>
+      </w:tblPr>
+      <w:tblGrid>
+        <w:gridCol w:w="4513"/>
+        <w:gridCol w:w="4513"/>
+      </w:tblGrid>
+      <w:tr>
+        <w:trPr/>
+        <w:tc>
+          <w:tcPr>
+            <w:tcBorders/>
+            <w:tcW w:w="4513" w:type="dxa"/>
+            <w:textDirection w:val="lrTb"/>
+            <w:noWrap w:val="false"/>
+          </w:tcPr>
+          <w:p>
+            <w:pPr>
+              <w:pBdr/>
+              <w:spacing/>
+              <w:ind/>
+              <w:rPr>
+                <w:b w:val="0"/>
+                <w:bCs w:val="0"/>
+                <w:highlight w:val="none"/>
+                <w:lang w:val="cs-CZ"/>
+              </w:rPr>
+            </w:pPr>
+            <w:r>
+              <w:rPr>
+                <w:b w:val="0"/>
+                <w:bCs w:val="0"/>
+                <w:highlight w:val="none"/>
+                <w:lang w:val="cs-CZ" w:bidi="cs-CZ"/>
+              </w:rPr>
+              <w:t xml:space="preserve">Dashboard</w:t>
+            </w:r>
+            <w:r>
+              <w:rPr>
+                <w:b w:val="0"/>
+                <w:bCs w:val="0"/>
+                <w:highlight w:val="none"/>
+                <w:lang w:val="cs-CZ"/>
+              </w:rPr>
+            </w:r>
+          </w:p>
+        </w:tc>
+        <w:tc>
+          <w:tcPr>
+            <w:tcBorders/>
+            <w:tcW w:w="4513" w:type="dxa"/>
+            <w:textDirection w:val="lrTb"/>
+            <w:noWrap w:val="false"/>
+          </w:tcPr>
+          <w:p>
+            <w:pPr>
+              <w:pBdr/>
+              <w:spacing/>
+              <w:ind/>
+              <w:rPr>
+                <w:b w:val="0"/>
+                <w:bCs w:val="0"/>
+                <w:highlight w:val="none"/>
+                <w:lang w:val="cs-CZ"/>
+              </w:rPr>
+            </w:pPr>
+            <w:r>
+              <w:rPr>
+                <w:b w:val="0"/>
+                <w:bCs w:val="0"/>
+                <w:highlight w:val="none"/>
+                <w:lang w:val="cs-CZ" w:bidi="cs-CZ"/>
+              </w:rPr>
+              <w:t xml:space="preserve">/admin</w:t>
+            </w:r>
+            <w:r>
+              <w:rPr>
+                <w:b w:val="0"/>
+                <w:bCs w:val="0"/>
+                <w:highlight w:val="none"/>
+                <w:lang w:val="cs-CZ"/>
+              </w:rPr>
+            </w:r>
+          </w:p>
+        </w:tc>
+      </w:tr>
+      <w:tr>
+        <w:trPr/>
+        <w:tc>
+          <w:tcPr>
+            <w:tcBorders/>
+            <w:tcW w:w="4513" w:type="dxa"/>
+            <w:textDirection w:val="lrTb"/>
+            <w:noWrap w:val="false"/>
+          </w:tcPr>
+          <w:p>
+            <w:pPr>
+              <w:pBdr/>
+              <w:spacing/>
+              <w:ind/>
+              <w:rPr>
+                <w:b w:val="0"/>
+                <w:bCs w:val="0"/>
+                <w:highlight w:val="none"/>
+                <w:lang w:val="cs-CZ"/>
+              </w:rPr>
+            </w:pPr>
+            <w:r>
+              <w:rPr>
+                <w:b w:val="0"/>
+                <w:bCs w:val="0"/>
+                <w:highlight w:val="none"/>
+                <w:lang w:val="cs-CZ" w:bidi="cs-CZ"/>
+              </w:rPr>
+              <w:t xml:space="preserve">Správá zmrzlináren</w:t>
+            </w:r>
+            <w:r>
+              <w:rPr>
+                <w:b w:val="0"/>
+                <w:bCs w:val="0"/>
+                <w:highlight w:val="none"/>
+                <w:lang w:val="cs-CZ"/>
+              </w:rPr>
+            </w:r>
+          </w:p>
+        </w:tc>
+        <w:tc>
+          <w:tcPr>
+            <w:tcBorders/>
+            <w:tcW w:w="4513" w:type="dxa"/>
+            <w:textDirection w:val="lrTb"/>
+            <w:noWrap w:val="false"/>
+          </w:tcPr>
+          <w:p>
+            <w:pPr>
+              <w:pBdr/>
+              <w:spacing/>
+              <w:ind/>
+              <w:rPr>
+                <w:b w:val="0"/>
+                <w:bCs w:val="0"/>
+                <w:highlight w:val="none"/>
+                <w:lang w:val="cs-CZ"/>
+              </w:rPr>
+            </w:pPr>
+            <w:r>
+              <w:rPr>
+                <w:b w:val="0"/>
+                <w:bCs w:val="0"/>
+                <w:highlight w:val="none"/>
+                <w:lang w:val="cs-CZ" w:bidi="cs-CZ"/>
+              </w:rPr>
+              <w:t xml:space="preserve">/admin/shops</w:t>
+            </w:r>
+            <w:r>
+              <w:rPr>
+                <w:b w:val="0"/>
+                <w:bCs w:val="0"/>
+                <w:highlight w:val="none"/>
+                <w:lang w:val="cs-CZ"/>
+              </w:rPr>
+            </w:r>
+          </w:p>
+        </w:tc>
+      </w:tr>
+      <w:tr>
+        <w:trPr/>
+        <w:tc>
+          <w:tcPr>
+            <w:tcBorders/>
+            <w:tcW w:w="4513" w:type="dxa"/>
+            <w:textDirection w:val="lrTb"/>
+            <w:noWrap w:val="false"/>
+          </w:tcPr>
+          <w:p>
+            <w:pPr>
+              <w:pBdr/>
+              <w:spacing/>
+              <w:ind/>
+              <w:rPr>
+                <w:b w:val="0"/>
+                <w:bCs w:val="0"/>
+                <w:highlight w:val="none"/>
+                <w:lang w:val="cs-CZ"/>
+              </w:rPr>
+            </w:pPr>
+            <w:r>
+              <w:rPr>
+                <w:b w:val="0"/>
+                <w:bCs w:val="0"/>
+                <w:highlight w:val="none"/>
+                <w:lang w:val="cs-CZ" w:bidi="cs-CZ"/>
+              </w:rPr>
+              <w:t xml:space="preserve">Správa produktů</w:t>
+            </w:r>
+            <w:r>
+              <w:rPr>
+                <w:b w:val="0"/>
+                <w:bCs w:val="0"/>
+                <w:highlight w:val="none"/>
+                <w:lang w:val="cs-CZ"/>
+              </w:rPr>
+            </w:r>
+          </w:p>
+        </w:tc>
+        <w:tc>
+          <w:tcPr>
+            <w:tcBorders/>
+            <w:tcW w:w="4513" w:type="dxa"/>
+            <w:textDirection w:val="lrTb"/>
+            <w:noWrap w:val="false"/>
+          </w:tcPr>
+          <w:p>
+            <w:pPr>
+              <w:pBdr/>
+              <w:spacing/>
+              <w:ind/>
+              <w:rPr>
+                <w:b w:val="0"/>
+                <w:bCs w:val="0"/>
+                <w:highlight w:val="none"/>
+                <w:lang w:val="cs-CZ"/>
+              </w:rPr>
+            </w:pPr>
+            <w:r>
+              <w:rPr>
+                <w:b w:val="0"/>
+                <w:bCs w:val="0"/>
+                <w:highlight w:val="none"/>
+                <w:lang w:val="cs-CZ" w:bidi="cs-CZ"/>
+              </w:rPr>
+              <w:t xml:space="preserve">/admin/products</w:t>
+            </w:r>
+            <w:r>
+              <w:rPr>
+                <w:b w:val="0"/>
+                <w:bCs w:val="0"/>
+                <w:highlight w:val="none"/>
+                <w:lang w:val="cs-CZ"/>
+              </w:rPr>
+            </w:r>
+          </w:p>
+        </w:tc>
+      </w:tr>
+      <w:tr>
+        <w:trPr/>
+        <w:tc>
+          <w:tcPr>
+            <w:tcBorders/>
+            <w:tcW w:w="4513" w:type="dxa"/>
+            <w:textDirection w:val="lrTb"/>
+            <w:noWrap w:val="false"/>
+          </w:tcPr>
+          <w:p>
+            <w:pPr>
+              <w:pBdr/>
+              <w:spacing/>
+              <w:ind/>
+              <w:rPr>
+                <w:b w:val="0"/>
+                <w:bCs w:val="0"/>
+                <w:highlight w:val="none"/>
+                <w:lang w:val="cs-CZ"/>
+              </w:rPr>
+            </w:pPr>
+            <w:r>
+              <w:rPr>
+                <w:b w:val="0"/>
+                <w:bCs w:val="0"/>
+                <w:highlight w:val="none"/>
+                <w:lang w:val="cs-CZ" w:bidi="cs-CZ"/>
+              </w:rPr>
+              <w:t xml:space="preserve">Správa objednávek</w:t>
+            </w:r>
+            <w:r>
+              <w:rPr>
+                <w:b w:val="0"/>
+                <w:bCs w:val="0"/>
+                <w:highlight w:val="none"/>
+                <w:lang w:val="cs-CZ"/>
+              </w:rPr>
+            </w:r>
+          </w:p>
+        </w:tc>
+        <w:tc>
+          <w:tcPr>
+            <w:tcBorders/>
+            <w:tcW w:w="4513" w:type="dxa"/>
+            <w:textDirection w:val="lrTb"/>
+            <w:noWrap w:val="false"/>
+          </w:tcPr>
+          <w:p>
+            <w:pPr>
+              <w:pBdr/>
+              <w:spacing/>
+              <w:ind/>
+              <w:rPr>
+                <w:b w:val="0"/>
+                <w:bCs w:val="0"/>
+                <w:highlight w:val="none"/>
+                <w:lang w:val="cs-CZ"/>
+              </w:rPr>
+            </w:pPr>
+            <w:r>
+              <w:rPr>
+                <w:b w:val="0"/>
+                <w:bCs w:val="0"/>
+                <w:highlight w:val="none"/>
+                <w:lang w:val="cs-CZ" w:bidi="cs-CZ"/>
+              </w:rPr>
+              <w:t xml:space="preserve">/admin/orders</w:t>
+            </w:r>
+            <w:r>
+              <w:rPr>
+                <w:b w:val="0"/>
+                <w:bCs w:val="0"/>
+                <w:highlight w:val="none"/>
+                <w:lang w:val="cs-CZ"/>
+              </w:rPr>
+            </w:r>
+          </w:p>
+        </w:tc>
+      </w:tr>
+    </w:tbl>
+    <w:p>
+      <w:pPr>
+        <w:pStyle w:val="881"/>
+        <w:pBdr/>
+        <w:spacing/>
+        <w:ind/>
+        <w:rPr>
+          <w:highlight w:val="none"/>
+        </w:rPr>
+      </w:pPr>
+      <w:r/>
+      <w:bookmarkStart w:id="23" w:name="_Toc7"/>
+      <w:r>
+        <w:rPr>
+          <w:lang w:val="cs-CZ"/>
+        </w:rPr>
+        <w:t xml:space="preserve">Prioritizace částí aplikace</w:t>
+      </w:r>
+      <w:bookmarkEnd w:id="7"/>
+      <w:r/>
+      <w:bookmarkEnd w:id="23"/>
+      <w:r/>
+      <w:r/>
+    </w:p>
+    <w:p>
+      <w:pPr>
+        <w:pBdr/>
+        <w:spacing/>
+        <w:ind/>
+        <w:rPr/>
+      </w:pPr>
+      <w:r>
+        <w:rPr>
+          <w:lang w:val="cs-CZ"/>
+        </w:rPr>
+        <w:t xml:space="preserve">Nejkritičtější část aplikace je klientská část viz. </w:t>
+      </w:r>
+      <w:hyperlink w:tooltip="#_Zákaznická" w:anchor="_Zákaznická" w:history="1">
+        <w:r>
+          <w:rPr>
+            <w:rStyle w:val="926"/>
+            <w:lang w:val="cs-CZ"/>
+          </w:rPr>
+          <w:t xml:space="preserve">Zákaznická část</w:t>
+        </w:r>
+      </w:hyperlink>
+      <w:r>
+        <w:rPr>
+          <w:lang w:val="cs-CZ"/>
+        </w:rPr>
+      </w:r>
+      <w:r/>
+    </w:p>
+    <w:p>
+      <w:pPr>
+        <w:pStyle w:val="881"/>
+        <w:pBdr/>
+        <w:spacing/>
+        <w:ind/>
+        <w:rPr/>
+      </w:pPr>
+      <w:r/>
+      <w:bookmarkStart w:id="24" w:name="_Toc8"/>
+      <w:r/>
       <w:r>
         <w:rPr>
           <w:b w:val="0"/>
@@ -1410,7 +3535,7 @@
         <w:t xml:space="preserve">Technologie</w:t>
       </w:r>
       <w:r/>
-      <w:bookmarkEnd w:id="3"/>
+      <w:bookmarkEnd w:id="24"/>
       <w:r/>
       <w:r/>
     </w:p>
@@ -1433,7 +3558,7 @@
         <w:rPr/>
       </w:pPr>
       <w:r/>
-      <w:bookmarkStart w:id="4" w:name="_Toc4"/>
+      <w:bookmarkStart w:id="25" w:name="_Toc9"/>
       <w:r>
         <w:rPr>
           <w:lang w:val="cs-CZ"/>
@@ -1441,7 +3566,7 @@
         <w:t xml:space="preserve">Struktura testů</w:t>
       </w:r>
       <w:r/>
-      <w:bookmarkEnd w:id="4"/>
+      <w:bookmarkEnd w:id="25"/>
       <w:r/>
       <w:r/>
     </w:p>
@@ -1464,7 +3589,7 @@
         <w:rPr/>
       </w:pPr>
       <w:r/>
-      <w:bookmarkStart w:id="5" w:name="_Toc5"/>
+      <w:bookmarkStart w:id="26" w:name="_Toc10"/>
       <w:r>
         <w:rPr>
           <w:b w:val="0"/>
@@ -1475,7 +3600,7 @@
         <w:t xml:space="preserve">Testovací scénáře</w:t>
       </w:r>
       <w:r/>
-      <w:bookmarkEnd w:id="5"/>
+      <w:bookmarkEnd w:id="26"/>
       <w:r/>
       <w:r/>
     </w:p>
@@ -1498,7 +3623,7 @@
         <w:rPr/>
       </w:pPr>
       <w:r/>
-      <w:bookmarkStart w:id="6" w:name="_Toc6"/>
+      <w:bookmarkStart w:id="27" w:name="_Toc11"/>
       <w:r>
         <w:rPr>
           <w:lang w:val="cs-CZ"/>
@@ -1506,7 +3631,7 @@
         <w:t xml:space="preserve">Uživatel</w:t>
       </w:r>
       <w:r/>
-      <w:bookmarkEnd w:id="6"/>
+      <w:bookmarkEnd w:id="27"/>
       <w:r/>
       <w:r/>
     </w:p>
@@ -1533,7 +3658,7 @@
         <w:rPr/>
       </w:pPr>
       <w:r/>
-      <w:bookmarkStart w:id="7" w:name="_Toc7"/>
+      <w:bookmarkStart w:id="28" w:name="_Toc12"/>
       <w:r>
         <w:rPr>
           <w:lang w:val="cs-CZ"/>
@@ -1541,7 +3666,7 @@
         <w:t xml:space="preserve">Objednání zmrzliny bez účtu</w:t>
       </w:r>
       <w:r/>
-      <w:bookmarkEnd w:id="7"/>
+      <w:bookmarkEnd w:id="28"/>
       <w:r/>
       <w:r/>
     </w:p>
@@ -1615,6 +3740,8 @@
         <w:rPr>
           <w:b w:val="0"/>
           <w:bCs w:val="0"/>
+          <w:highlight w:val="none"/>
+          <w:lang w:val="cs-CZ"/>
         </w:rPr>
       </w:r>
       <w:r>
@@ -2297,8 +4424,6 @@
         <w:rPr>
           <w:b w:val="0"/>
           <w:bCs w:val="0"/>
-          <w:highlight w:val="none"/>
-          <w:lang w:val="cs-CZ"/>
         </w:rPr>
       </w:r>
       <w:r>
@@ -2332,7 +4457,7 @@
         </w:rPr>
       </w:pPr>
       <w:r/>
-      <w:bookmarkStart w:id="8" w:name="_Toc8"/>
+      <w:bookmarkStart w:id="29" w:name="_Toc13"/>
       <w:r>
         <w:rPr>
           <w:b w:val="0"/>
@@ -2342,15 +4467,8 @@
         </w:rPr>
         <w:t xml:space="preserve">Registrace uživatele</w:t>
       </w:r>
-      <w:r>
-        <w:rPr>
-          <w:b w:val="0"/>
-          <w:bCs w:val="0"/>
-          <w:highlight w:val="none"/>
-          <w:lang w:val="cs-CZ"/>
-        </w:rPr>
-      </w:r>
-      <w:bookmarkEnd w:id="8"/>
+      <w:r/>
+      <w:bookmarkEnd w:id="29"/>
       <w:r/>
       <w:r>
         <w:rPr>
@@ -2687,9 +4805,64 @@
       </w:pPr>
       <w:r/>
       <w:r/>
+      <w:r/>
     </w:p>
     <w:p>
       <w:pPr>
+        <w:pBdr/>
+        <w:spacing/>
+        <w:ind/>
+        <w:rPr/>
+      </w:pPr>
+      <w:r/>
+      <w:r/>
+      <w:r/>
+    </w:p>
+    <w:p>
+      <w:pPr>
+        <w:pBdr/>
+        <w:spacing/>
+        <w:ind/>
+        <w:rPr/>
+      </w:pPr>
+      <w:r/>
+      <w:r/>
+      <w:r/>
+    </w:p>
+    <w:p>
+      <w:pPr>
+        <w:pBdr/>
+        <w:spacing/>
+        <w:ind/>
+        <w:rPr/>
+      </w:pPr>
+      <w:r/>
+      <w:r/>
+      <w:r/>
+    </w:p>
+    <w:p>
+      <w:pPr>
+        <w:pBdr/>
+        <w:spacing/>
+        <w:ind/>
+        <w:rPr/>
+      </w:pPr>
+      <w:r/>
+      <w:r/>
+      <w:r/>
+    </w:p>
+    <w:p>
+      <w:pPr>
+        <w:pBdr/>
+        <w:spacing/>
+        <w:ind/>
+        <w:rPr/>
+      </w:pPr>
+      <w:r/>
+      <w:r/>
+    </w:p>
+    <w:p>
+      <w:pPr>
         <w:pStyle w:val="882"/>
         <w:pBdr/>
         <w:spacing/>
@@ -2697,14 +4870,15 @@
         <w:rPr/>
       </w:pPr>
       <w:r/>
-      <w:bookmarkStart w:id="9" w:name="_Toc9"/>
+      <w:bookmarkStart w:id="30" w:name="_Toc14"/>
       <w:r>
         <w:rPr>
           <w:lang w:val="cs-CZ"/>
         </w:rPr>
         <w:t xml:space="preserve">Předvyplnění formuláře objednávky pro přihlášené uživatele</w:t>
       </w:r>
-      <w:bookmarkEnd w:id="9"/>
+      <w:r/>
+      <w:bookmarkEnd w:id="30"/>
       <w:r/>
       <w:r/>
     </w:p>
@@ -2875,6 +5049,13 @@
           <w:highlight w:val="none"/>
         </w:rPr>
       </w:r>
+      <w:r>
+        <w:rPr>
+          <w:b w:val="0"/>
+          <w:bCs w:val="0"/>
+          <w:highlight w:val="none"/>
+        </w:rPr>
+      </w:r>
     </w:p>
     <w:p>
       <w:pPr>
@@ -2926,6 +5107,13 @@
           <w:highlight w:val="none"/>
         </w:rPr>
       </w:r>
+      <w:r>
+        <w:rPr>
+          <w:b w:val="0"/>
+          <w:bCs w:val="0"/>
+          <w:highlight w:val="none"/>
+        </w:rPr>
+      </w:r>
     </w:p>
     <w:p>
       <w:pPr>
@@ -2959,6 +5147,13 @@
           <w:highlight w:val="none"/>
         </w:rPr>
       </w:r>
+      <w:r>
+        <w:rPr>
+          <w:b w:val="0"/>
+          <w:bCs w:val="0"/>
+          <w:highlight w:val="none"/>
+        </w:rPr>
+      </w:r>
     </w:p>
     <w:p>
       <w:pPr>
@@ -2984,6 +5179,13 @@
           <w:lang w:val="cs-CZ" w:bidi="cs-CZ"/>
         </w:rPr>
         <w:t xml:space="preserve">Potvrdit objednávk</w:t>
+      </w:r>
+      <w:r>
+        <w:rPr>
+          <w:b w:val="0"/>
+          <w:bCs w:val="0"/>
+          <w:highlight w:val="none"/>
+        </w:rPr>
       </w:r>
       <w:r>
         <w:rPr>
@@ -3032,19 +5234,8 @@
           <w:b w:val="0"/>
           <w:bCs w:val="0"/>
           <w:highlight w:val="none"/>
-          <w:lang w:val="cs-CZ" w:bidi="cs-CZ"/>
         </w:rPr>
       </w:r>
-      <w:r>
-        <w:rPr>
-          <w:b/>
-          <w:bCs/>
-          <w:highlight w:val="none"/>
-          <w:lang w:val="cs-CZ" w:bidi="cs-CZ"/>
-        </w:rPr>
-      </w:r>
-      <w:r/>
-      <w:r/>
       <w:r>
         <w:rPr>
           <w:b w:val="0"/>
@@ -3676,6 +5867,300 @@
       <w:suff w:val="tab"/>
     </w:lvl>
   </w:abstractNum>
+  <w:abstractNum w:abstractNumId="3">
+    <w:nsid w:val="55452F0E"/>
+    <w:lvl w:ilvl="0">
+      <w:isLgl w:val="false"/>
+      <w:lvlJc w:val="left"/>
+      <w:lvlText w:val="–"/>
+      <w:numFmt w:val="bullet"/>
+      <w:pPr>
+        <w:pBdr/>
+        <w:spacing/>
+        <w:ind w:hanging="360" w:left="709"/>
+      </w:pPr>
+      <w:rPr>
+        <w:rFonts w:hint="default" w:ascii="Arial" w:hAnsi="Arial" w:eastAsia="Arial" w:cs="Arial"/>
+      </w:rPr>
+      <w:start w:val="1"/>
+      <w:suff w:val="tab"/>
+    </w:lvl>
+    <w:lvl w:ilvl="1">
+      <w:isLgl w:val="false"/>
+      <w:lvlJc w:val="left"/>
+      <w:lvlText w:val="o"/>
+      <w:numFmt w:val="bullet"/>
+      <w:pPr>
+        <w:pBdr/>
+        <w:spacing/>
+        <w:ind w:hanging="360" w:left="1429"/>
+      </w:pPr>
+      <w:rPr>
+        <w:rFonts w:hint="default" w:ascii="Courier New" w:hAnsi="Courier New" w:eastAsia="Courier New" w:cs="Courier New"/>
+      </w:rPr>
+      <w:start w:val="1"/>
+      <w:suff w:val="tab"/>
+    </w:lvl>
+    <w:lvl w:ilvl="2">
+      <w:isLgl w:val="false"/>
+      <w:lvlJc w:val="left"/>
+      <w:lvlText w:val="§"/>
+      <w:numFmt w:val="bullet"/>
+      <w:pPr>
+        <w:pBdr/>
+        <w:spacing/>
+        <w:ind w:hanging="360" w:left="2149"/>
+      </w:pPr>
+      <w:rPr>
+        <w:rFonts w:hint="default" w:ascii="Wingdings" w:hAnsi="Wingdings" w:eastAsia="Wingdings" w:cs="Wingdings"/>
+      </w:rPr>
+      <w:start w:val="1"/>
+      <w:suff w:val="tab"/>
+    </w:lvl>
+    <w:lvl w:ilvl="3">
+      <w:isLgl w:val="false"/>
+      <w:lvlJc w:val="left"/>
+      <w:lvlText w:val="·"/>
+      <w:numFmt w:val="bullet"/>
+      <w:pPr>
+        <w:pBdr/>
+        <w:spacing/>
+        <w:ind w:hanging="360" w:left="2869"/>
+      </w:pPr>
+      <w:rPr>
+        <w:rFonts w:hint="default" w:ascii="Symbol" w:hAnsi="Symbol" w:eastAsia="Symbol" w:cs="Symbol"/>
+      </w:rPr>
+      <w:start w:val="1"/>
+      <w:suff w:val="tab"/>
+    </w:lvl>
+    <w:lvl w:ilvl="4">
+      <w:isLgl w:val="false"/>
+      <w:lvlJc w:val="left"/>
+      <w:lvlText w:val="o"/>
+      <w:numFmt w:val="bullet"/>
+      <w:pPr>
+        <w:pBdr/>
+        <w:spacing/>
+        <w:ind w:hanging="360" w:left="3589"/>
+      </w:pPr>
+      <w:rPr>
+        <w:rFonts w:hint="default" w:ascii="Courier New" w:hAnsi="Courier New" w:eastAsia="Courier New" w:cs="Courier New"/>
+      </w:rPr>
+      <w:start w:val="1"/>
+      <w:suff w:val="tab"/>
+    </w:lvl>
+    <w:lvl w:ilvl="5">
+      <w:isLgl w:val="false"/>
+      <w:lvlJc w:val="left"/>
+      <w:lvlText w:val="§"/>
+      <w:numFmt w:val="bullet"/>
+      <w:pPr>
+        <w:pBdr/>
+        <w:spacing/>
+        <w:ind w:hanging="360" w:left="4309"/>
+      </w:pPr>
+      <w:rPr>
+        <w:rFonts w:hint="default" w:ascii="Wingdings" w:hAnsi="Wingdings" w:eastAsia="Wingdings" w:cs="Wingdings"/>
+      </w:rPr>
+      <w:start w:val="1"/>
+      <w:suff w:val="tab"/>
+    </w:lvl>
+    <w:lvl w:ilvl="6">
+      <w:isLgl w:val="false"/>
+      <w:lvlJc w:val="left"/>
+      <w:lvlText w:val="·"/>
+      <w:numFmt w:val="bullet"/>
+      <w:pPr>
+        <w:pBdr/>
+        <w:spacing/>
+        <w:ind w:hanging="360" w:left="5029"/>
+      </w:pPr>
+      <w:rPr>
+        <w:rFonts w:hint="default" w:ascii="Symbol" w:hAnsi="Symbol" w:eastAsia="Symbol" w:cs="Symbol"/>
+      </w:rPr>
+      <w:start w:val="1"/>
+      <w:suff w:val="tab"/>
+    </w:lvl>
+    <w:lvl w:ilvl="7">
+      <w:isLgl w:val="false"/>
+      <w:lvlJc w:val="left"/>
+      <w:lvlText w:val="o"/>
+      <w:numFmt w:val="bullet"/>
+      <w:pPr>
+        <w:pBdr/>
+        <w:spacing/>
+        <w:ind w:hanging="360" w:left="5749"/>
+      </w:pPr>
+      <w:rPr>
+        <w:rFonts w:hint="default" w:ascii="Courier New" w:hAnsi="Courier New" w:eastAsia="Courier New" w:cs="Courier New"/>
+      </w:rPr>
+      <w:start w:val="1"/>
+      <w:suff w:val="tab"/>
+    </w:lvl>
+    <w:lvl w:ilvl="8">
+      <w:isLgl w:val="false"/>
+      <w:lvlJc w:val="left"/>
+      <w:lvlText w:val="§"/>
+      <w:numFmt w:val="bullet"/>
+      <w:pPr>
+        <w:pBdr/>
+        <w:spacing/>
+        <w:ind w:hanging="360" w:left="6469"/>
+      </w:pPr>
+      <w:rPr>
+        <w:rFonts w:hint="default" w:ascii="Wingdings" w:hAnsi="Wingdings" w:eastAsia="Wingdings" w:cs="Wingdings"/>
+      </w:rPr>
+      <w:start w:val="1"/>
+      <w:suff w:val="tab"/>
+    </w:lvl>
+  </w:abstractNum>
+  <w:abstractNum w:abstractNumId="4">
+    <w:nsid w:val="3D1FB335"/>
+    <w:lvl w:ilvl="0">
+      <w:isLgl w:val="false"/>
+      <w:lvlJc w:val="left"/>
+      <w:lvlText w:val="–"/>
+      <w:numFmt w:val="bullet"/>
+      <w:pPr>
+        <w:pBdr/>
+        <w:spacing/>
+        <w:ind w:hanging="360" w:left="709"/>
+      </w:pPr>
+      <w:rPr>
+        <w:rFonts w:hint="default" w:ascii="Arial" w:hAnsi="Arial" w:eastAsia="Arial" w:cs="Arial"/>
+      </w:rPr>
+      <w:start w:val="1"/>
+      <w:suff w:val="tab"/>
+    </w:lvl>
+    <w:lvl w:ilvl="1">
+      <w:isLgl w:val="false"/>
+      <w:lvlJc w:val="left"/>
+      <w:lvlText w:val="o"/>
+      <w:numFmt w:val="bullet"/>
+      <w:pPr>
+        <w:pBdr/>
+        <w:spacing/>
+        <w:ind w:hanging="360" w:left="1429"/>
+      </w:pPr>
+      <w:rPr>
+        <w:rFonts w:hint="default" w:ascii="Courier New" w:hAnsi="Courier New" w:eastAsia="Courier New" w:cs="Courier New"/>
+      </w:rPr>
+      <w:start w:val="1"/>
+      <w:suff w:val="tab"/>
+    </w:lvl>
+    <w:lvl w:ilvl="2">
+      <w:isLgl w:val="false"/>
+      <w:lvlJc w:val="left"/>
+      <w:lvlText w:val="§"/>
+      <w:numFmt w:val="bullet"/>
+      <w:pPr>
+        <w:pBdr/>
+        <w:spacing/>
+        <w:ind w:hanging="360" w:left="2149"/>
+      </w:pPr>
+      <w:rPr>
+        <w:rFonts w:hint="default" w:ascii="Wingdings" w:hAnsi="Wingdings" w:eastAsia="Wingdings" w:cs="Wingdings"/>
+      </w:rPr>
+      <w:start w:val="1"/>
+      <w:suff w:val="tab"/>
+    </w:lvl>
+    <w:lvl w:ilvl="3">
+      <w:isLgl w:val="false"/>
+      <w:lvlJc w:val="left"/>
+      <w:lvlText w:val="·"/>
+      <w:numFmt w:val="bullet"/>
+      <w:pPr>
+        <w:pBdr/>
+        <w:spacing/>
+        <w:ind w:hanging="360" w:left="2869"/>
+      </w:pPr>
+      <w:rPr>
+        <w:rFonts w:hint="default" w:ascii="Symbol" w:hAnsi="Symbol" w:eastAsia="Symbol" w:cs="Symbol"/>
+      </w:rPr>
+      <w:start w:val="1"/>
+      <w:suff w:val="tab"/>
+    </w:lvl>
+    <w:lvl w:ilvl="4">
+      <w:isLgl w:val="false"/>
+      <w:lvlJc w:val="left"/>
+      <w:lvlText w:val="o"/>
+      <w:numFmt w:val="bullet"/>
+      <w:pPr>
+        <w:pBdr/>
+        <w:spacing/>
+        <w:ind w:hanging="360" w:left="3589"/>
+      </w:pPr>
+      <w:rPr>
+        <w:rFonts w:hint="default" w:ascii="Courier New" w:hAnsi="Courier New" w:eastAsia="Courier New" w:cs="Courier New"/>
+      </w:rPr>
+      <w:start w:val="1"/>
+      <w:suff w:val="tab"/>
+    </w:lvl>
+    <w:lvl w:ilvl="5">
+      <w:isLgl w:val="false"/>
+      <w:lvlJc w:val="left"/>
+      <w:lvlText w:val="§"/>
+      <w:numFmt w:val="bullet"/>
+      <w:pPr>
+        <w:pBdr/>
+        <w:spacing/>
+        <w:ind w:hanging="360" w:left="4309"/>
+      </w:pPr>
+      <w:rPr>
+        <w:rFonts w:hint="default" w:ascii="Wingdings" w:hAnsi="Wingdings" w:eastAsia="Wingdings" w:cs="Wingdings"/>
+      </w:rPr>
+      <w:start w:val="1"/>
+      <w:suff w:val="tab"/>
+    </w:lvl>
+    <w:lvl w:ilvl="6">
+      <w:isLgl w:val="false"/>
+      <w:lvlJc w:val="left"/>
+      <w:lvlText w:val="·"/>
+      <w:numFmt w:val="bullet"/>
+      <w:pPr>
+        <w:pBdr/>
+        <w:spacing/>
+        <w:ind w:hanging="360" w:left="5029"/>
+      </w:pPr>
+      <w:rPr>
+        <w:rFonts w:hint="default" w:ascii="Symbol" w:hAnsi="Symbol" w:eastAsia="Symbol" w:cs="Symbol"/>
+      </w:rPr>
+      <w:start w:val="1"/>
+      <w:suff w:val="tab"/>
+    </w:lvl>
+    <w:lvl w:ilvl="7">
+      <w:isLgl w:val="false"/>
+      <w:lvlJc w:val="left"/>
+      <w:lvlText w:val="o"/>
+      <w:numFmt w:val="bullet"/>
+      <w:pPr>
+        <w:pBdr/>
+        <w:spacing/>
+        <w:ind w:hanging="360" w:left="5749"/>
+      </w:pPr>
+      <w:rPr>
+        <w:rFonts w:hint="default" w:ascii="Courier New" w:hAnsi="Courier New" w:eastAsia="Courier New" w:cs="Courier New"/>
+      </w:rPr>
+      <w:start w:val="1"/>
+      <w:suff w:val="tab"/>
+    </w:lvl>
+    <w:lvl w:ilvl="8">
+      <w:isLgl w:val="false"/>
+      <w:lvlJc w:val="left"/>
+      <w:lvlText w:val="§"/>
+      <w:numFmt w:val="bullet"/>
+      <w:pPr>
+        <w:pBdr/>
+        <w:spacing/>
+        <w:ind w:hanging="360" w:left="6469"/>
+      </w:pPr>
+      <w:rPr>
+        <w:rFonts w:hint="default" w:ascii="Wingdings" w:hAnsi="Wingdings" w:eastAsia="Wingdings" w:cs="Wingdings"/>
+      </w:rPr>
+      <w:start w:val="1"/>
+      <w:suff w:val="tab"/>
+    </w:lvl>
+  </w:abstractNum>
   <w:num w:numId="1">
     <w:abstractNumId w:val="0"/>
   </w:num>
@@ -3684,6 +6169,12 @@
   </w:num>
   <w:num w:numId="3">
     <w:abstractNumId w:val="2"/>
+  </w:num>
+  <w:num w:numId="4">
+    <w:abstractNumId w:val="3"/>
+  </w:num>
+  <w:num w:numId="5">
+    <w:abstractNumId w:val="4"/>
   </w:num>
 </w:numbering>
 </file>
@@ -34109,12 +36600,12 @@
     <w:unhideWhenUsed/>
     <w:pPr>
       <w:pBdr/>
-      <w:spacing w:after="170"/>
-      <w:ind w:right="0" w:firstLine="0" w:left="0"/>
+      <w:spacing w:after="100"/>
+      <w:ind/>
     </w:pPr>
     <w:rPr>
-      <w:b/>
-      <w:sz w:val="28"/>
+      <w:color w:val="00c8c3" w:themeColor="hyperlink"/>
+      <w:u w:val="single"/>
     </w:rPr>
   </w:style>
   <w:style w:type="paragraph" w:styleId="929">
@@ -34125,12 +36616,12 @@
     <w:unhideWhenUsed/>
     <w:pPr>
       <w:pBdr/>
-      <w:spacing w:after="57"/>
-      <w:ind w:right="0" w:firstLine="0" w:left="0"/>
+      <w:spacing w:after="100"/>
+      <w:ind w:left="220"/>
     </w:pPr>
     <w:rPr>
-      <w:b/>
-      <w:sz w:val="26"/>
+      <w:color w:val="00c8c3" w:themeColor="hyperlink"/>
+      <w:u w:val="single"/>
     </w:rPr>
   </w:style>
   <w:style w:type="paragraph" w:styleId="930">
@@ -34141,11 +36632,12 @@
     <w:unhideWhenUsed/>
     <w:pPr>
       <w:pBdr/>
-      <w:spacing w:after="57"/>
-      <w:ind w:right="0" w:firstLine="283" w:left="0"/>
+      <w:spacing w:after="100"/>
+      <w:ind w:left="440"/>
     </w:pPr>
     <w:rPr>
-      <w:sz w:val="26"/>
+      <w:color w:val="00c8c3" w:themeColor="hyperlink"/>
+      <w:u w:val="single"/>
     </w:rPr>
   </w:style>
   <w:style w:type="paragraph" w:styleId="931">
@@ -34157,10 +36649,11 @@
     <w:pPr>
       <w:pBdr/>
       <w:spacing w:after="57"/>
-      <w:ind w:right="0" w:firstLine="567" w:left="0"/>
+      <w:ind w:left="850"/>
     </w:pPr>
     <w:rPr>
-      <w:sz w:val="22"/>
+      <w:color w:val="00c8c3" w:themeColor="hyperlink"/>
+      <w:u w:val="single"/>
     </w:rPr>
   </w:style>
   <w:style w:type="paragraph" w:styleId="932">
@@ -34172,10 +36665,11 @@
     <w:pPr>
       <w:pBdr/>
       <w:spacing w:after="57"/>
-      <w:ind w:right="0" w:firstLine="850" w:left="0"/>
+      <w:ind w:left="1134"/>
     </w:pPr>
     <w:rPr>
-      <w:sz w:val="22"/>
+      <w:color w:val="00c8c3" w:themeColor="hyperlink"/>
+      <w:u w:val="single"/>
     </w:rPr>
   </w:style>
   <w:style w:type="paragraph" w:styleId="933">
@@ -34187,10 +36681,11 @@
     <w:pPr>
       <w:pBdr/>
       <w:spacing w:after="57"/>
-      <w:ind w:right="0" w:firstLine="1134" w:left="0"/>
+      <w:ind w:left="1417"/>
     </w:pPr>
     <w:rPr>
-      <w:sz w:val="22"/>
+      <w:color w:val="00c8c3" w:themeColor="hyperlink"/>
+      <w:u w:val="single"/>
     </w:rPr>
   </w:style>
   <w:style w:type="paragraph" w:styleId="934">
@@ -34202,10 +36697,11 @@
     <w:pPr>
       <w:pBdr/>
       <w:spacing w:after="57"/>
-      <w:ind w:right="0" w:firstLine="1417" w:left="0"/>
+      <w:ind w:left="1701"/>
     </w:pPr>
     <w:rPr>
-      <w:sz w:val="22"/>
+      <w:color w:val="00c8c3" w:themeColor="hyperlink"/>
+      <w:u w:val="single"/>
     </w:rPr>
   </w:style>
   <w:style w:type="paragraph" w:styleId="935">
@@ -34217,10 +36713,11 @@
     <w:pPr>
       <w:pBdr/>
       <w:spacing w:after="57"/>
-      <w:ind w:right="0" w:firstLine="1701" w:left="0"/>
+      <w:ind w:left="1984"/>
     </w:pPr>
     <w:rPr>
-      <w:sz w:val="22"/>
+      <w:color w:val="00c8c3" w:themeColor="hyperlink"/>
+      <w:u w:val="single"/>
     </w:rPr>
   </w:style>
   <w:style w:type="paragraph" w:styleId="936">
@@ -34232,10 +36729,11 @@
     <w:pPr>
       <w:pBdr/>
       <w:spacing w:after="57"/>
-      <w:ind w:right="0" w:firstLine="1984" w:left="0"/>
+      <w:ind w:left="2268"/>
     </w:pPr>
     <w:rPr>
-      <w:sz w:val="22"/>
+      <w:color w:val="00c8c3" w:themeColor="hyperlink"/>
+      <w:u w:val="single"/>
     </w:rPr>
   </w:style>
   <w:style w:type="character" w:styleId="937">

</xml_diff>